<commit_message>
update prompt – fixed image fallback
</commit_message>
<xml_diff>
--- a/sablony/kratky.docx
+++ b/sablony/kratky.docx
@@ -8,9 +8,9 @@
         <w:suppressAutoHyphens w:val="1"/>
         <w:spacing w:before="0" w:line="240" w:lineRule="auto"/>
         <w:rPr>
-          <w:rFonts w:ascii="Times Roman" w:cs="Times Roman" w:hAnsi="Times Roman" w:eastAsia="Times Roman"/>
-          <w:sz w:val="24"/>
-          <w:szCs w:val="24"/>
+          <w:rFonts w:ascii="Arial" w:cs="Arial" w:hAnsi="Arial" w:eastAsia="Arial"/>
+          <w:sz w:val="29"/>
+          <w:szCs w:val="29"/>
         </w:rPr>
       </w:pPr>
       <w:r>
@@ -29,6 +29,7 @@
           <w:sz w:val="29"/>
           <w:szCs w:val="29"/>
           <w:rtl w:val="0"/>
+          <w:lang w:val="en-US"/>
         </w:rPr>
         <w:t>Á</w:t>
       </w:r>
@@ -38,6 +39,7 @@
           <w:sz w:val="29"/>
           <w:szCs w:val="29"/>
           <w:rtl w:val="0"/>
+          <w:lang w:val="en-US"/>
         </w:rPr>
         <w:t>TK</w:t>
       </w:r>
@@ -47,6 +49,7 @@
           <w:sz w:val="29"/>
           <w:szCs w:val="29"/>
           <w:rtl w:val="0"/>
+          <w:lang w:val="en-US"/>
         </w:rPr>
         <w:t xml:space="preserve">Ý </w:t>
       </w:r>
@@ -67,9 +70,9 @@
         <w:suppressAutoHyphens w:val="1"/>
         <w:spacing w:before="0" w:line="240" w:lineRule="auto"/>
         <w:rPr>
-          <w:rFonts w:ascii="Times Roman" w:cs="Times Roman" w:hAnsi="Times Roman" w:eastAsia="Times Roman"/>
-          <w:sz w:val="24"/>
-          <w:szCs w:val="24"/>
+          <w:rFonts w:ascii="Arial" w:cs="Arial" w:hAnsi="Arial" w:eastAsia="Arial"/>
+          <w:sz w:val="29"/>
+          <w:szCs w:val="29"/>
         </w:rPr>
       </w:pPr>
       <w:r>
@@ -89,17 +92,18 @@
         <w:suppressAutoHyphens w:val="1"/>
         <w:spacing w:before="0" w:line="240" w:lineRule="auto"/>
         <w:rPr>
-          <w:rFonts w:ascii="Times Roman" w:cs="Times Roman" w:hAnsi="Times Roman" w:eastAsia="Times Roman"/>
-          <w:sz w:val="24"/>
-          <w:szCs w:val="24"/>
-        </w:rPr>
-      </w:pPr>
-      <w:r>
-        <w:rPr>
-          <w:rFonts w:ascii="Arial" w:hAnsi="Arial"/>
-          <w:sz w:val="29"/>
-          <w:szCs w:val="29"/>
-          <w:rtl w:val="0"/>
+          <w:rFonts w:ascii="Arial" w:cs="Arial" w:hAnsi="Arial" w:eastAsia="Arial"/>
+          <w:sz w:val="29"/>
+          <w:szCs w:val="29"/>
+        </w:rPr>
+      </w:pPr>
+      <w:r>
+        <w:rPr>
+          <w:rFonts w:ascii="Arial" w:hAnsi="Arial"/>
+          <w:sz w:val="29"/>
+          <w:szCs w:val="29"/>
+          <w:rtl w:val="0"/>
+          <w:lang w:val="en-US"/>
         </w:rPr>
         <w:t>.short-desc {</w:t>
       </w:r>
@@ -110,295 +114,216 @@
         <w:suppressAutoHyphens w:val="1"/>
         <w:spacing w:before="0" w:line="240" w:lineRule="auto"/>
         <w:rPr>
-          <w:rFonts w:ascii="Times Roman" w:cs="Times Roman" w:hAnsi="Times Roman" w:eastAsia="Times Roman"/>
-          <w:sz w:val="24"/>
-          <w:szCs w:val="24"/>
-        </w:rPr>
-      </w:pPr>
-      <w:r>
-        <w:rPr>
-          <w:rFonts w:ascii="Arial" w:hAnsi="Arial" w:hint="default"/>
-          <w:sz w:val="29"/>
-          <w:szCs w:val="29"/>
-          <w:rtl w:val="0"/>
-        </w:rPr>
-        <w:t>  </w:t>
-      </w:r>
-      <w:r>
-        <w:rPr>
-          <w:rFonts w:ascii="Arial" w:hAnsi="Arial"/>
-          <w:sz w:val="29"/>
-          <w:szCs w:val="29"/>
-          <w:rtl w:val="0"/>
-          <w:lang w:val="nl-NL"/>
-        </w:rPr>
-        <w:t>font-family: 'Inter', 'Helvetica Neue', sans-serif;</w:t>
-      </w:r>
-    </w:p>
-    <w:p>
-      <w:pPr>
-        <w:pStyle w:val="Výchozí"/>
-        <w:suppressAutoHyphens w:val="1"/>
-        <w:spacing w:before="0" w:line="240" w:lineRule="auto"/>
-        <w:rPr>
-          <w:rFonts w:ascii="Times Roman" w:cs="Times Roman" w:hAnsi="Times Roman" w:eastAsia="Times Roman"/>
-          <w:sz w:val="24"/>
-          <w:szCs w:val="24"/>
-        </w:rPr>
-      </w:pPr>
-      <w:r>
-        <w:rPr>
-          <w:rFonts w:ascii="Arial" w:hAnsi="Arial" w:hint="default"/>
-          <w:sz w:val="29"/>
-          <w:szCs w:val="29"/>
-          <w:rtl w:val="0"/>
-        </w:rPr>
-        <w:t>  </w:t>
-      </w:r>
-      <w:r>
-        <w:rPr>
-          <w:rFonts w:ascii="Arial" w:hAnsi="Arial"/>
-          <w:sz w:val="29"/>
-          <w:szCs w:val="29"/>
-          <w:rtl w:val="0"/>
-        </w:rPr>
-        <w:t>color: #333;</w:t>
-      </w:r>
-    </w:p>
-    <w:p>
-      <w:pPr>
-        <w:pStyle w:val="Výchozí"/>
-        <w:suppressAutoHyphens w:val="1"/>
-        <w:spacing w:before="0" w:line="240" w:lineRule="auto"/>
-        <w:rPr>
-          <w:rFonts w:ascii="Times Roman" w:cs="Times Roman" w:hAnsi="Times Roman" w:eastAsia="Times Roman"/>
-          <w:sz w:val="24"/>
-          <w:szCs w:val="24"/>
-        </w:rPr>
-      </w:pPr>
-      <w:r>
-        <w:rPr>
-          <w:rFonts w:ascii="Arial" w:hAnsi="Arial" w:hint="default"/>
-          <w:sz w:val="29"/>
-          <w:szCs w:val="29"/>
-          <w:rtl w:val="0"/>
-        </w:rPr>
-        <w:t>  </w:t>
-      </w:r>
-      <w:r>
-        <w:rPr>
-          <w:rFonts w:ascii="Arial" w:hAnsi="Arial"/>
-          <w:sz w:val="29"/>
-          <w:szCs w:val="29"/>
-          <w:rtl w:val="0"/>
-          <w:lang w:val="en-US"/>
-        </w:rPr>
-        <w:t>font-size: 15px;</w:t>
-      </w:r>
-    </w:p>
-    <w:p>
-      <w:pPr>
-        <w:pStyle w:val="Výchozí"/>
-        <w:suppressAutoHyphens w:val="1"/>
-        <w:spacing w:before="0" w:line="240" w:lineRule="auto"/>
-        <w:rPr>
-          <w:rFonts w:ascii="Times Roman" w:cs="Times Roman" w:hAnsi="Times Roman" w:eastAsia="Times Roman"/>
-          <w:sz w:val="24"/>
-          <w:szCs w:val="24"/>
-        </w:rPr>
-      </w:pPr>
-      <w:r>
-        <w:rPr>
-          <w:rFonts w:ascii="Arial" w:hAnsi="Arial" w:hint="default"/>
-          <w:sz w:val="29"/>
-          <w:szCs w:val="29"/>
-          <w:rtl w:val="0"/>
-        </w:rPr>
-        <w:t>  </w:t>
-      </w:r>
-      <w:r>
-        <w:rPr>
-          <w:rFonts w:ascii="Arial" w:hAnsi="Arial"/>
-          <w:sz w:val="29"/>
-          <w:szCs w:val="29"/>
-          <w:rtl w:val="0"/>
-          <w:lang w:val="en-US"/>
-        </w:rPr>
-        <w:t>line-height: 1.6;</w:t>
-      </w:r>
-    </w:p>
-    <w:p>
-      <w:pPr>
-        <w:pStyle w:val="Výchozí"/>
-        <w:suppressAutoHyphens w:val="1"/>
-        <w:spacing w:before="0" w:line="240" w:lineRule="auto"/>
-        <w:rPr>
-          <w:rFonts w:ascii="Times Roman" w:cs="Times Roman" w:hAnsi="Times Roman" w:eastAsia="Times Roman"/>
-          <w:sz w:val="24"/>
-          <w:szCs w:val="24"/>
-        </w:rPr>
-      </w:pPr>
-      <w:r>
-        <w:rPr>
-          <w:rFonts w:ascii="Arial" w:hAnsi="Arial" w:hint="default"/>
-          <w:sz w:val="29"/>
-          <w:szCs w:val="29"/>
-          <w:rtl w:val="0"/>
-        </w:rPr>
-        <w:t>  </w:t>
-      </w:r>
-      <w:r>
-        <w:rPr>
-          <w:rFonts w:ascii="Arial" w:hAnsi="Arial"/>
-          <w:sz w:val="29"/>
-          <w:szCs w:val="29"/>
-          <w:rtl w:val="0"/>
-          <w:lang w:val="en-US"/>
-        </w:rPr>
-        <w:t>background: #fff;</w:t>
-      </w:r>
-    </w:p>
-    <w:p>
-      <w:pPr>
-        <w:pStyle w:val="Výchozí"/>
-        <w:suppressAutoHyphens w:val="1"/>
-        <w:spacing w:before="0" w:line="240" w:lineRule="auto"/>
-        <w:rPr>
-          <w:rFonts w:ascii="Times Roman" w:cs="Times Roman" w:hAnsi="Times Roman" w:eastAsia="Times Roman"/>
-          <w:sz w:val="24"/>
-          <w:szCs w:val="24"/>
-        </w:rPr>
-      </w:pPr>
-      <w:r>
-        <w:rPr>
-          <w:rFonts w:ascii="Arial" w:hAnsi="Arial" w:hint="default"/>
-          <w:sz w:val="29"/>
-          <w:szCs w:val="29"/>
-          <w:rtl w:val="0"/>
-        </w:rPr>
-        <w:t>  </w:t>
-      </w:r>
-      <w:r>
-        <w:rPr>
-          <w:rFonts w:ascii="Arial" w:hAnsi="Arial"/>
-          <w:sz w:val="29"/>
-          <w:szCs w:val="29"/>
-          <w:rtl w:val="0"/>
-          <w:lang w:val="en-US"/>
-        </w:rPr>
-        <w:t>border-left: 4px solid #ffffff;</w:t>
-      </w:r>
-    </w:p>
-    <w:p>
-      <w:pPr>
-        <w:pStyle w:val="Výchozí"/>
-        <w:suppressAutoHyphens w:val="1"/>
-        <w:spacing w:before="0" w:line="240" w:lineRule="auto"/>
-        <w:rPr>
-          <w:rFonts w:ascii="Times Roman" w:cs="Times Roman" w:hAnsi="Times Roman" w:eastAsia="Times Roman"/>
-          <w:sz w:val="24"/>
-          <w:szCs w:val="24"/>
-        </w:rPr>
-      </w:pPr>
-      <w:r>
-        <w:rPr>
-          <w:rFonts w:ascii="Arial" w:hAnsi="Arial" w:hint="default"/>
-          <w:sz w:val="29"/>
-          <w:szCs w:val="29"/>
-          <w:rtl w:val="0"/>
-        </w:rPr>
-        <w:t>  </w:t>
-      </w:r>
-      <w:r>
-        <w:rPr>
-          <w:rFonts w:ascii="Arial" w:hAnsi="Arial"/>
-          <w:sz w:val="29"/>
-          <w:szCs w:val="29"/>
-          <w:rtl w:val="0"/>
-          <w:lang w:val="en-US"/>
-        </w:rPr>
-        <w:t>padding: 16px 20px;</w:t>
-      </w:r>
-    </w:p>
-    <w:p>
-      <w:pPr>
-        <w:pStyle w:val="Výchozí"/>
-        <w:suppressAutoHyphens w:val="1"/>
-        <w:spacing w:before="0" w:line="240" w:lineRule="auto"/>
-        <w:rPr>
-          <w:rFonts w:ascii="Times Roman" w:cs="Times Roman" w:hAnsi="Times Roman" w:eastAsia="Times Roman"/>
-          <w:sz w:val="24"/>
-          <w:szCs w:val="24"/>
-        </w:rPr>
-      </w:pPr>
-      <w:r>
-        <w:rPr>
-          <w:rFonts w:ascii="Arial" w:hAnsi="Arial" w:hint="default"/>
-          <w:sz w:val="29"/>
-          <w:szCs w:val="29"/>
-          <w:rtl w:val="0"/>
-        </w:rPr>
-        <w:t>  </w:t>
-      </w:r>
-      <w:r>
-        <w:rPr>
-          <w:rFonts w:ascii="Arial" w:hAnsi="Arial"/>
-          <w:sz w:val="29"/>
-          <w:szCs w:val="29"/>
-          <w:rtl w:val="0"/>
-          <w:lang w:val="de-DE"/>
-        </w:rPr>
-        <w:t>border-radius: 10px;</w:t>
-      </w:r>
-    </w:p>
-    <w:p>
-      <w:pPr>
-        <w:pStyle w:val="Výchozí"/>
-        <w:suppressAutoHyphens w:val="1"/>
-        <w:spacing w:before="0" w:line="240" w:lineRule="auto"/>
-        <w:rPr>
-          <w:rFonts w:ascii="Times Roman" w:cs="Times Roman" w:hAnsi="Times Roman" w:eastAsia="Times Roman"/>
-          <w:sz w:val="24"/>
-          <w:szCs w:val="24"/>
-        </w:rPr>
-      </w:pPr>
-      <w:r>
-        <w:rPr>
-          <w:rFonts w:ascii="Arial" w:hAnsi="Arial" w:hint="default"/>
-          <w:sz w:val="29"/>
-          <w:szCs w:val="29"/>
-          <w:rtl w:val="0"/>
-        </w:rPr>
-        <w:t>  </w:t>
-      </w:r>
-      <w:r>
-        <w:rPr>
-          <w:rFonts w:ascii="Arial" w:hAnsi="Arial"/>
-          <w:sz w:val="29"/>
-          <w:szCs w:val="29"/>
-          <w:rtl w:val="0"/>
-          <w:lang w:val="en-US"/>
-        </w:rPr>
-        <w:t>box-shadow: 0 2px 8px rgba(0,0,0,0.05);</w:t>
-      </w:r>
-    </w:p>
-    <w:p>
-      <w:pPr>
-        <w:pStyle w:val="Výchozí"/>
-        <w:suppressAutoHyphens w:val="1"/>
-        <w:spacing w:before="0" w:line="240" w:lineRule="auto"/>
-        <w:rPr>
-          <w:rFonts w:ascii="Times Roman" w:cs="Times Roman" w:hAnsi="Times Roman" w:eastAsia="Times Roman"/>
-          <w:sz w:val="24"/>
-          <w:szCs w:val="24"/>
-        </w:rPr>
-      </w:pPr>
-      <w:r>
-        <w:rPr>
-          <w:rFonts w:ascii="Arial" w:hAnsi="Arial"/>
-          <w:sz w:val="29"/>
-          <w:szCs w:val="29"/>
-          <w:rtl w:val="0"/>
+          <w:rFonts w:ascii="Arial" w:cs="Arial" w:hAnsi="Arial" w:eastAsia="Arial"/>
+          <w:sz w:val="29"/>
+          <w:szCs w:val="29"/>
+        </w:rPr>
+      </w:pPr>
+      <w:r>
+        <w:rPr>
+          <w:rFonts w:ascii="Arial" w:hAnsi="Arial"/>
+          <w:sz w:val="29"/>
+          <w:szCs w:val="29"/>
+          <w:rtl w:val="0"/>
+          <w:lang w:val="en-US"/>
+        </w:rPr>
+        <w:t xml:space="preserve">  font-family: 'Inter', 'Helvetica Neue', sans-serif;</w:t>
+      </w:r>
+    </w:p>
+    <w:p>
+      <w:pPr>
+        <w:pStyle w:val="Výchozí"/>
+        <w:suppressAutoHyphens w:val="1"/>
+        <w:spacing w:before="0" w:line="240" w:lineRule="auto"/>
+        <w:rPr>
+          <w:rFonts w:ascii="Arial" w:cs="Arial" w:hAnsi="Arial" w:eastAsia="Arial"/>
+          <w:sz w:val="29"/>
+          <w:szCs w:val="29"/>
+        </w:rPr>
+      </w:pPr>
+      <w:r>
+        <w:rPr>
+          <w:rFonts w:ascii="Arial" w:hAnsi="Arial"/>
+          <w:sz w:val="29"/>
+          <w:szCs w:val="29"/>
+          <w:rtl w:val="0"/>
+          <w:lang w:val="en-US"/>
+        </w:rPr>
+        <w:t xml:space="preserve">  color: #333;</w:t>
+      </w:r>
+    </w:p>
+    <w:p>
+      <w:pPr>
+        <w:pStyle w:val="Výchozí"/>
+        <w:suppressAutoHyphens w:val="1"/>
+        <w:spacing w:before="0" w:line="240" w:lineRule="auto"/>
+        <w:rPr>
+          <w:rFonts w:ascii="Arial" w:cs="Arial" w:hAnsi="Arial" w:eastAsia="Arial"/>
+          <w:sz w:val="29"/>
+          <w:szCs w:val="29"/>
+        </w:rPr>
+      </w:pPr>
+      <w:r>
+        <w:rPr>
+          <w:rFonts w:ascii="Arial" w:hAnsi="Arial"/>
+          <w:sz w:val="29"/>
+          <w:szCs w:val="29"/>
+          <w:rtl w:val="0"/>
+          <w:lang w:val="en-US"/>
+        </w:rPr>
+        <w:t xml:space="preserve">  font-size: 15px;</w:t>
+      </w:r>
+    </w:p>
+    <w:p>
+      <w:pPr>
+        <w:pStyle w:val="Výchozí"/>
+        <w:suppressAutoHyphens w:val="1"/>
+        <w:spacing w:before="0" w:line="240" w:lineRule="auto"/>
+        <w:rPr>
+          <w:rFonts w:ascii="Arial" w:cs="Arial" w:hAnsi="Arial" w:eastAsia="Arial"/>
+          <w:sz w:val="29"/>
+          <w:szCs w:val="29"/>
+        </w:rPr>
+      </w:pPr>
+      <w:r>
+        <w:rPr>
+          <w:rFonts w:ascii="Arial" w:hAnsi="Arial"/>
+          <w:sz w:val="29"/>
+          <w:szCs w:val="29"/>
+          <w:rtl w:val="0"/>
+          <w:lang w:val="en-US"/>
+        </w:rPr>
+        <w:t xml:space="preserve">  line-height: 1.6;</w:t>
+      </w:r>
+    </w:p>
+    <w:p>
+      <w:pPr>
+        <w:pStyle w:val="Výchozí"/>
+        <w:suppressAutoHyphens w:val="1"/>
+        <w:spacing w:before="0" w:line="240" w:lineRule="auto"/>
+        <w:rPr>
+          <w:rFonts w:ascii="Arial" w:cs="Arial" w:hAnsi="Arial" w:eastAsia="Arial"/>
+          <w:sz w:val="29"/>
+          <w:szCs w:val="29"/>
+        </w:rPr>
+      </w:pPr>
+      <w:r>
+        <w:rPr>
+          <w:rFonts w:ascii="Arial" w:hAnsi="Arial"/>
+          <w:sz w:val="29"/>
+          <w:szCs w:val="29"/>
+          <w:rtl w:val="0"/>
+          <w:lang w:val="en-US"/>
+        </w:rPr>
+        <w:t xml:space="preserve">  background: #fff;</w:t>
+      </w:r>
+    </w:p>
+    <w:p>
+      <w:pPr>
+        <w:pStyle w:val="Výchozí"/>
+        <w:suppressAutoHyphens w:val="1"/>
+        <w:spacing w:before="0" w:line="240" w:lineRule="auto"/>
+        <w:rPr>
+          <w:rFonts w:ascii="Arial" w:cs="Arial" w:hAnsi="Arial" w:eastAsia="Arial"/>
+          <w:sz w:val="29"/>
+          <w:szCs w:val="29"/>
+        </w:rPr>
+      </w:pPr>
+      <w:r>
+        <w:rPr>
+          <w:rFonts w:ascii="Arial" w:hAnsi="Arial"/>
+          <w:sz w:val="29"/>
+          <w:szCs w:val="29"/>
+          <w:rtl w:val="0"/>
+          <w:lang w:val="en-US"/>
+        </w:rPr>
+        <w:t xml:space="preserve">  border-left: 4px solid #ffffff;</w:t>
+      </w:r>
+    </w:p>
+    <w:p>
+      <w:pPr>
+        <w:pStyle w:val="Výchozí"/>
+        <w:suppressAutoHyphens w:val="1"/>
+        <w:spacing w:before="0" w:line="240" w:lineRule="auto"/>
+        <w:rPr>
+          <w:rFonts w:ascii="Arial" w:cs="Arial" w:hAnsi="Arial" w:eastAsia="Arial"/>
+          <w:sz w:val="29"/>
+          <w:szCs w:val="29"/>
+        </w:rPr>
+      </w:pPr>
+      <w:r>
+        <w:rPr>
+          <w:rFonts w:ascii="Arial" w:hAnsi="Arial"/>
+          <w:sz w:val="29"/>
+          <w:szCs w:val="29"/>
+          <w:rtl w:val="0"/>
+          <w:lang w:val="en-US"/>
+        </w:rPr>
+        <w:t xml:space="preserve">  padding: 16px 20px;</w:t>
+      </w:r>
+    </w:p>
+    <w:p>
+      <w:pPr>
+        <w:pStyle w:val="Výchozí"/>
+        <w:suppressAutoHyphens w:val="1"/>
+        <w:spacing w:before="0" w:line="240" w:lineRule="auto"/>
+        <w:rPr>
+          <w:rFonts w:ascii="Arial" w:cs="Arial" w:hAnsi="Arial" w:eastAsia="Arial"/>
+          <w:sz w:val="29"/>
+          <w:szCs w:val="29"/>
+        </w:rPr>
+      </w:pPr>
+      <w:r>
+        <w:rPr>
+          <w:rFonts w:ascii="Arial" w:hAnsi="Arial"/>
+          <w:sz w:val="29"/>
+          <w:szCs w:val="29"/>
+          <w:rtl w:val="0"/>
+          <w:lang w:val="en-US"/>
+        </w:rPr>
+        <w:t xml:space="preserve">  border-radius: 10px;</w:t>
+      </w:r>
+    </w:p>
+    <w:p>
+      <w:pPr>
+        <w:pStyle w:val="Výchozí"/>
+        <w:suppressAutoHyphens w:val="1"/>
+        <w:spacing w:before="0" w:line="240" w:lineRule="auto"/>
+        <w:rPr>
+          <w:rFonts w:ascii="Arial" w:cs="Arial" w:hAnsi="Arial" w:eastAsia="Arial"/>
+          <w:sz w:val="29"/>
+          <w:szCs w:val="29"/>
+        </w:rPr>
+      </w:pPr>
+      <w:r>
+        <w:rPr>
+          <w:rFonts w:ascii="Arial" w:hAnsi="Arial"/>
+          <w:sz w:val="29"/>
+          <w:szCs w:val="29"/>
+          <w:rtl w:val="0"/>
+          <w:lang w:val="en-US"/>
+        </w:rPr>
+        <w:t xml:space="preserve">  box-shadow: 0 2px 8px rgba(0,0,0,0.05);</w:t>
+      </w:r>
+    </w:p>
+    <w:p>
+      <w:pPr>
+        <w:pStyle w:val="Výchozí"/>
+        <w:suppressAutoHyphens w:val="1"/>
+        <w:spacing w:before="0" w:line="240" w:lineRule="auto"/>
+        <w:rPr>
+          <w:rFonts w:ascii="Arial" w:cs="Arial" w:hAnsi="Arial" w:eastAsia="Arial"/>
+          <w:sz w:val="29"/>
+          <w:szCs w:val="29"/>
+        </w:rPr>
+      </w:pPr>
+      <w:r>
+        <w:rPr>
+          <w:rFonts w:ascii="Arial" w:hAnsi="Arial"/>
+          <w:sz w:val="29"/>
+          <w:szCs w:val="29"/>
+          <w:rtl w:val="0"/>
+          <w:lang w:val="en-US"/>
         </w:rPr>
         <w:t>}</w:t>
       </w:r>
@@ -409,17 +334,30 @@
         <w:suppressAutoHyphens w:val="1"/>
         <w:spacing w:before="0" w:line="240" w:lineRule="auto"/>
         <w:rPr>
-          <w:rFonts w:ascii="Times Roman" w:cs="Times Roman" w:hAnsi="Times Roman" w:eastAsia="Times Roman"/>
-          <w:sz w:val="24"/>
-          <w:szCs w:val="24"/>
-        </w:rPr>
-      </w:pPr>
-      <w:r>
-        <w:rPr>
-          <w:rFonts w:ascii="Arial" w:hAnsi="Arial"/>
-          <w:sz w:val="29"/>
-          <w:szCs w:val="29"/>
-          <w:rtl w:val="0"/>
+          <w:rFonts w:ascii="Arial" w:cs="Arial" w:hAnsi="Arial" w:eastAsia="Arial"/>
+          <w:sz w:val="29"/>
+          <w:szCs w:val="29"/>
+        </w:rPr>
+      </w:pPr>
+    </w:p>
+    <w:p>
+      <w:pPr>
+        <w:pStyle w:val="Výchozí"/>
+        <w:suppressAutoHyphens w:val="1"/>
+        <w:spacing w:before="0" w:line="240" w:lineRule="auto"/>
+        <w:rPr>
+          <w:rFonts w:ascii="Arial" w:cs="Arial" w:hAnsi="Arial" w:eastAsia="Arial"/>
+          <w:sz w:val="29"/>
+          <w:szCs w:val="29"/>
+        </w:rPr>
+      </w:pPr>
+      <w:r>
+        <w:rPr>
+          <w:rFonts w:ascii="Arial" w:hAnsi="Arial"/>
+          <w:sz w:val="29"/>
+          <w:szCs w:val="29"/>
+          <w:rtl w:val="0"/>
+          <w:lang w:val="en-US"/>
         </w:rPr>
         <w:t>.short-desc p { margin: 8px 0; }</w:t>
       </w:r>
@@ -430,17 +368,30 @@
         <w:suppressAutoHyphens w:val="1"/>
         <w:spacing w:before="0" w:line="240" w:lineRule="auto"/>
         <w:rPr>
-          <w:rFonts w:ascii="Times Roman" w:cs="Times Roman" w:hAnsi="Times Roman" w:eastAsia="Times Roman"/>
-          <w:sz w:val="24"/>
-          <w:szCs w:val="24"/>
-        </w:rPr>
-      </w:pPr>
-      <w:r>
-        <w:rPr>
-          <w:rFonts w:ascii="Arial" w:hAnsi="Arial"/>
-          <w:sz w:val="29"/>
-          <w:szCs w:val="29"/>
-          <w:rtl w:val="0"/>
+          <w:rFonts w:ascii="Arial" w:cs="Arial" w:hAnsi="Arial" w:eastAsia="Arial"/>
+          <w:sz w:val="29"/>
+          <w:szCs w:val="29"/>
+        </w:rPr>
+      </w:pPr>
+    </w:p>
+    <w:p>
+      <w:pPr>
+        <w:pStyle w:val="Výchozí"/>
+        <w:suppressAutoHyphens w:val="1"/>
+        <w:spacing w:before="0" w:line="240" w:lineRule="auto"/>
+        <w:rPr>
+          <w:rFonts w:ascii="Arial" w:cs="Arial" w:hAnsi="Arial" w:eastAsia="Arial"/>
+          <w:sz w:val="29"/>
+          <w:szCs w:val="29"/>
+        </w:rPr>
+      </w:pPr>
+      <w:r>
+        <w:rPr>
+          <w:rFonts w:ascii="Arial" w:hAnsi="Arial"/>
+          <w:sz w:val="29"/>
+          <w:szCs w:val="29"/>
+          <w:rtl w:val="0"/>
+          <w:lang w:val="en-US"/>
         </w:rPr>
         <w:t>.short-desc strong { color: #3a0c0c; }</w:t>
       </w:r>
@@ -451,18 +402,30 @@
         <w:suppressAutoHyphens w:val="1"/>
         <w:spacing w:before="0" w:line="240" w:lineRule="auto"/>
         <w:rPr>
-          <w:rFonts w:ascii="Times Roman" w:cs="Times Roman" w:hAnsi="Times Roman" w:eastAsia="Times Roman"/>
-          <w:sz w:val="24"/>
-          <w:szCs w:val="24"/>
-        </w:rPr>
-      </w:pPr>
-      <w:r>
-        <w:rPr>
-          <w:rFonts w:ascii="Arial" w:hAnsi="Arial"/>
-          <w:sz w:val="29"/>
-          <w:szCs w:val="29"/>
-          <w:rtl w:val="0"/>
-          <w:lang w:val="pt-PT"/>
+          <w:rFonts w:ascii="Arial" w:cs="Arial" w:hAnsi="Arial" w:eastAsia="Arial"/>
+          <w:sz w:val="29"/>
+          <w:szCs w:val="29"/>
+        </w:rPr>
+      </w:pPr>
+    </w:p>
+    <w:p>
+      <w:pPr>
+        <w:pStyle w:val="Výchozí"/>
+        <w:suppressAutoHyphens w:val="1"/>
+        <w:spacing w:before="0" w:line="240" w:lineRule="auto"/>
+        <w:rPr>
+          <w:rFonts w:ascii="Arial" w:cs="Arial" w:hAnsi="Arial" w:eastAsia="Arial"/>
+          <w:sz w:val="29"/>
+          <w:szCs w:val="29"/>
+        </w:rPr>
+      </w:pPr>
+      <w:r>
+        <w:rPr>
+          <w:rFonts w:ascii="Arial" w:hAnsi="Arial"/>
+          <w:sz w:val="29"/>
+          <w:szCs w:val="29"/>
+          <w:rtl w:val="0"/>
+          <w:lang w:val="en-US"/>
         </w:rPr>
         <w:t>.short-desc em { color: #666; }</w:t>
       </w:r>
@@ -473,9 +436,9 @@
         <w:suppressAutoHyphens w:val="1"/>
         <w:spacing w:before="0" w:line="240" w:lineRule="auto"/>
         <w:rPr>
-          <w:rFonts w:ascii="Times Roman" w:cs="Times Roman" w:hAnsi="Times Roman" w:eastAsia="Times Roman"/>
-          <w:sz w:val="24"/>
-          <w:szCs w:val="24"/>
+          <w:rFonts w:ascii="Arial" w:cs="Arial" w:hAnsi="Arial" w:eastAsia="Arial"/>
+          <w:sz w:val="29"/>
+          <w:szCs w:val="29"/>
         </w:rPr>
       </w:pPr>
       <w:r>
@@ -495,29 +458,33 @@
         <w:suppressAutoHyphens w:val="1"/>
         <w:spacing w:before="0" w:line="240" w:lineRule="auto"/>
         <w:rPr>
-          <w:rFonts w:ascii="Times Roman" w:cs="Times Roman" w:hAnsi="Times Roman" w:eastAsia="Times Roman"/>
-        </w:rPr>
-      </w:pPr>
-    </w:p>
-    <w:p>
-      <w:pPr>
-        <w:pStyle w:val="Výchozí"/>
-        <w:suppressAutoHyphens w:val="1"/>
-        <w:spacing w:before="0" w:line="240" w:lineRule="auto"/>
-        <w:rPr>
-          <w:rFonts w:ascii="Times Roman" w:cs="Times Roman" w:hAnsi="Times Roman" w:eastAsia="Times Roman"/>
-        </w:rPr>
-      </w:pPr>
-    </w:p>
-    <w:p>
-      <w:pPr>
-        <w:pStyle w:val="Výchozí"/>
-        <w:suppressAutoHyphens w:val="1"/>
-        <w:spacing w:before="0" w:line="240" w:lineRule="auto"/>
-        <w:rPr>
-          <w:rFonts w:ascii="Times Roman" w:cs="Times Roman" w:hAnsi="Times Roman" w:eastAsia="Times Roman"/>
-          <w:sz w:val="24"/>
-          <w:szCs w:val="24"/>
+          <w:rFonts w:ascii="Arial" w:cs="Arial" w:hAnsi="Arial" w:eastAsia="Arial"/>
+          <w:sz w:val="29"/>
+          <w:szCs w:val="29"/>
+        </w:rPr>
+      </w:pPr>
+    </w:p>
+    <w:p>
+      <w:pPr>
+        <w:pStyle w:val="Výchozí"/>
+        <w:suppressAutoHyphens w:val="1"/>
+        <w:spacing w:before="0" w:line="240" w:lineRule="auto"/>
+        <w:rPr>
+          <w:rFonts w:ascii="Arial" w:cs="Arial" w:hAnsi="Arial" w:eastAsia="Arial"/>
+          <w:sz w:val="29"/>
+          <w:szCs w:val="29"/>
+        </w:rPr>
+      </w:pPr>
+    </w:p>
+    <w:p>
+      <w:pPr>
+        <w:pStyle w:val="Výchozí"/>
+        <w:suppressAutoHyphens w:val="1"/>
+        <w:spacing w:before="0" w:line="240" w:lineRule="auto"/>
+        <w:rPr>
+          <w:rFonts w:ascii="Arial" w:cs="Arial" w:hAnsi="Arial" w:eastAsia="Arial"/>
+          <w:sz w:val="29"/>
+          <w:szCs w:val="29"/>
         </w:rPr>
       </w:pPr>
       <w:r>
@@ -536,6 +503,7 @@
           <w:sz w:val="29"/>
           <w:szCs w:val="29"/>
           <w:rtl w:val="0"/>
+          <w:lang w:val="en-US"/>
         </w:rPr>
         <w:t>Á</w:t>
       </w:r>
@@ -545,6 +513,7 @@
           <w:sz w:val="29"/>
           <w:szCs w:val="29"/>
           <w:rtl w:val="0"/>
+          <w:lang w:val="en-US"/>
         </w:rPr>
         <w:t>TK</w:t>
       </w:r>
@@ -554,6 +523,7 @@
           <w:sz w:val="29"/>
           <w:szCs w:val="29"/>
           <w:rtl w:val="0"/>
+          <w:lang w:val="en-US"/>
         </w:rPr>
         <w:t xml:space="preserve">Ý </w:t>
       </w:r>
@@ -563,15 +533,17 @@
           <w:sz w:val="29"/>
           <w:szCs w:val="29"/>
           <w:rtl w:val="0"/>
-        </w:rPr>
-        <w:t>POPIS (KOMPAKTN</w:t>
-      </w:r>
-      <w:r>
-        <w:rPr>
-          <w:rFonts w:ascii="Arial" w:hAnsi="Arial" w:hint="default"/>
-          <w:sz w:val="29"/>
-          <w:szCs w:val="29"/>
-          <w:rtl w:val="0"/>
+          <w:lang w:val="en-US"/>
+        </w:rPr>
+        <w:t>POPIS (PRODEJN</w:t>
+      </w:r>
+      <w:r>
+        <w:rPr>
+          <w:rFonts w:ascii="Arial" w:hAnsi="Arial" w:hint="default"/>
+          <w:sz w:val="29"/>
+          <w:szCs w:val="29"/>
+          <w:rtl w:val="0"/>
+          <w:lang w:val="en-US"/>
         </w:rPr>
         <w:t xml:space="preserve">Í </w:t>
       </w:r>
@@ -581,17 +553,39 @@
           <w:sz w:val="29"/>
           <w:szCs w:val="29"/>
           <w:rtl w:val="0"/>
-        </w:rPr>
-        <w:t>/ PRODEJN</w:t>
-      </w:r>
-      <w:r>
-        <w:rPr>
-          <w:rFonts w:ascii="Arial" w:hAnsi="Arial" w:hint="default"/>
-          <w:sz w:val="29"/>
-          <w:szCs w:val="29"/>
-          <w:rtl w:val="0"/>
-        </w:rPr>
-        <w:t>Í</w:t>
+          <w:lang w:val="en-US"/>
+        </w:rPr>
+        <w:t xml:space="preserve">/ </w:t>
+      </w:r>
+      <w:r>
+        <w:rPr>
+          <w:rFonts w:ascii="Arial" w:hAnsi="Arial" w:hint="default"/>
+          <w:sz w:val="29"/>
+          <w:szCs w:val="29"/>
+          <w:rtl w:val="0"/>
+          <w:lang w:val="en-US"/>
+        </w:rPr>
+        <w:t>Č</w:t>
+      </w:r>
+      <w:r>
+        <w:rPr>
+          <w:rFonts w:ascii="Arial" w:hAnsi="Arial"/>
+          <w:sz w:val="29"/>
+          <w:szCs w:val="29"/>
+          <w:rtl w:val="0"/>
+          <w:lang w:val="en-US"/>
+        </w:rPr>
+        <w:t>TIV</w:t>
+      </w:r>
+      <w:r>
+        <w:rPr>
+          <w:rFonts w:ascii="Arial" w:hAnsi="Arial" w:hint="default"/>
+          <w:sz w:val="29"/>
+          <w:szCs w:val="29"/>
+          <w:rtl w:val="0"/>
+          <w:lang w:val="en-US"/>
+        </w:rPr>
+        <w:t>Ý</w:t>
       </w:r>
       <w:r>
         <w:rPr>
@@ -610,19 +604,21 @@
         <w:suppressAutoHyphens w:val="1"/>
         <w:spacing w:before="0" w:line="240" w:lineRule="auto"/>
         <w:rPr>
-          <w:rFonts w:ascii="Times Roman" w:cs="Times Roman" w:hAnsi="Times Roman" w:eastAsia="Times Roman"/>
-        </w:rPr>
-      </w:pPr>
-    </w:p>
-    <w:p>
-      <w:pPr>
-        <w:pStyle w:val="Výchozí"/>
-        <w:suppressAutoHyphens w:val="1"/>
-        <w:spacing w:before="0" w:line="240" w:lineRule="auto"/>
-        <w:rPr>
-          <w:rFonts w:ascii="Times Roman" w:cs="Times Roman" w:hAnsi="Times Roman" w:eastAsia="Times Roman"/>
-          <w:sz w:val="24"/>
-          <w:szCs w:val="24"/>
+          <w:rFonts w:ascii="Arial" w:cs="Arial" w:hAnsi="Arial" w:eastAsia="Arial"/>
+          <w:sz w:val="29"/>
+          <w:szCs w:val="29"/>
+        </w:rPr>
+      </w:pPr>
+    </w:p>
+    <w:p>
+      <w:pPr>
+        <w:pStyle w:val="Výchozí"/>
+        <w:suppressAutoHyphens w:val="1"/>
+        <w:spacing w:before="0" w:line="240" w:lineRule="auto"/>
+        <w:rPr>
+          <w:rFonts w:ascii="Arial" w:cs="Arial" w:hAnsi="Arial" w:eastAsia="Arial"/>
+          <w:sz w:val="29"/>
+          <w:szCs w:val="29"/>
         </w:rPr>
       </w:pPr>
       <w:r>
@@ -642,65 +638,62 @@
         <w:suppressAutoHyphens w:val="1"/>
         <w:spacing w:before="0" w:line="240" w:lineRule="auto"/>
         <w:rPr>
-          <w:rFonts w:ascii="Times Roman" w:cs="Times Roman" w:hAnsi="Times Roman" w:eastAsia="Times Roman"/>
-          <w:sz w:val="24"/>
-          <w:szCs w:val="24"/>
-        </w:rPr>
-      </w:pPr>
-      <w:r>
-        <w:rPr>
-          <w:rFonts w:ascii="Arial" w:hAnsi="Arial" w:hint="default"/>
-          <w:sz w:val="29"/>
-          <w:szCs w:val="29"/>
-          <w:rtl w:val="0"/>
-        </w:rPr>
-        <w:t>  </w:t>
-      </w:r>
-      <w:r>
-        <w:rPr>
-          <w:rFonts w:ascii="Arial" w:hAnsi="Arial"/>
-          <w:sz w:val="29"/>
-          <w:szCs w:val="29"/>
-          <w:rtl w:val="0"/>
-        </w:rPr>
-        <w:t>&lt;p&gt;</w:t>
-      </w:r>
-    </w:p>
-    <w:p>
-      <w:pPr>
-        <w:pStyle w:val="Výchozí"/>
-        <w:suppressAutoHyphens w:val="1"/>
-        <w:spacing w:before="0" w:line="240" w:lineRule="auto"/>
-        <w:rPr>
-          <w:rFonts w:ascii="Times Roman" w:cs="Times Roman" w:hAnsi="Times Roman" w:eastAsia="Times Roman"/>
-          <w:sz w:val="24"/>
-          <w:szCs w:val="24"/>
-        </w:rPr>
-      </w:pPr>
-      <w:r>
-        <w:rPr>
-          <w:rFonts w:ascii="Arial" w:hAnsi="Arial" w:hint="default"/>
-          <w:sz w:val="29"/>
-          <w:szCs w:val="29"/>
-          <w:rtl w:val="0"/>
-        </w:rPr>
-        <w:t>    </w:t>
-      </w:r>
-      <w:r>
-        <w:rPr>
-          <w:rFonts w:ascii="Arial" w:hAnsi="Arial"/>
-          <w:sz w:val="29"/>
-          <w:szCs w:val="29"/>
-          <w:rtl w:val="0"/>
-        </w:rPr>
-        <w:t>&lt;strong&gt;{n</w:t>
-      </w:r>
-      <w:r>
-        <w:rPr>
-          <w:rFonts w:ascii="Arial" w:hAnsi="Arial" w:hint="default"/>
-          <w:sz w:val="29"/>
-          <w:szCs w:val="29"/>
-          <w:rtl w:val="0"/>
+          <w:rFonts w:ascii="Arial" w:cs="Arial" w:hAnsi="Arial" w:eastAsia="Arial"/>
+          <w:sz w:val="29"/>
+          <w:szCs w:val="29"/>
+        </w:rPr>
+      </w:pPr>
+    </w:p>
+    <w:p>
+      <w:pPr>
+        <w:pStyle w:val="Výchozí"/>
+        <w:suppressAutoHyphens w:val="1"/>
+        <w:spacing w:before="0" w:line="240" w:lineRule="auto"/>
+        <w:rPr>
+          <w:rFonts w:ascii="Arial" w:cs="Arial" w:hAnsi="Arial" w:eastAsia="Arial"/>
+          <w:sz w:val="29"/>
+          <w:szCs w:val="29"/>
+        </w:rPr>
+      </w:pPr>
+      <w:r>
+        <w:rPr>
+          <w:rFonts w:ascii="Arial" w:hAnsi="Arial"/>
+          <w:sz w:val="29"/>
+          <w:szCs w:val="29"/>
+          <w:rtl w:val="0"/>
+          <w:lang w:val="en-US"/>
+        </w:rPr>
+        <w:t xml:space="preserve">  &lt;p&gt;</w:t>
+      </w:r>
+    </w:p>
+    <w:p>
+      <w:pPr>
+        <w:pStyle w:val="Výchozí"/>
+        <w:suppressAutoHyphens w:val="1"/>
+        <w:spacing w:before="0" w:line="240" w:lineRule="auto"/>
+        <w:rPr>
+          <w:rFonts w:ascii="Arial" w:cs="Arial" w:hAnsi="Arial" w:eastAsia="Arial"/>
+          <w:sz w:val="29"/>
+          <w:szCs w:val="29"/>
+        </w:rPr>
+      </w:pPr>
+      <w:r>
+        <w:rPr>
+          <w:rFonts w:ascii="Arial" w:hAnsi="Arial"/>
+          <w:sz w:val="29"/>
+          <w:szCs w:val="29"/>
+          <w:rtl w:val="0"/>
+          <w:lang w:val="en-US"/>
+        </w:rPr>
+        <w:t xml:space="preserve">    &lt;strong&gt;{n</w:t>
+      </w:r>
+      <w:r>
+        <w:rPr>
+          <w:rFonts w:ascii="Arial" w:hAnsi="Arial" w:hint="default"/>
+          <w:sz w:val="29"/>
+          <w:szCs w:val="29"/>
+          <w:rtl w:val="0"/>
+          <w:lang w:val="en-US"/>
         </w:rPr>
         <w:t>á</w:t>
       </w:r>
@@ -710,15 +703,239 @@
           <w:sz w:val="29"/>
           <w:szCs w:val="29"/>
           <w:rtl w:val="0"/>
-        </w:rPr>
-        <w:t>zev_sady}&lt;/strong&gt; je obl</w:t>
-      </w:r>
-      <w:r>
-        <w:rPr>
-          <w:rFonts w:ascii="Arial" w:hAnsi="Arial" w:hint="default"/>
-          <w:sz w:val="29"/>
-          <w:szCs w:val="29"/>
-          <w:rtl w:val="0"/>
+          <w:lang w:val="en-US"/>
+        </w:rPr>
+        <w:t>zev_sady}&lt;/strong&gt; roz</w:t>
+      </w:r>
+      <w:r>
+        <w:rPr>
+          <w:rFonts w:ascii="Arial" w:hAnsi="Arial" w:hint="default"/>
+          <w:sz w:val="29"/>
+          <w:szCs w:val="29"/>
+          <w:rtl w:val="0"/>
+          <w:lang w:val="en-US"/>
+        </w:rPr>
+        <w:t>š</w:t>
+      </w:r>
+      <w:r>
+        <w:rPr>
+          <w:rFonts w:ascii="Arial" w:hAnsi="Arial"/>
+          <w:sz w:val="29"/>
+          <w:szCs w:val="29"/>
+          <w:rtl w:val="0"/>
+          <w:lang w:val="en-US"/>
+        </w:rPr>
+        <w:t>i</w:t>
+      </w:r>
+      <w:r>
+        <w:rPr>
+          <w:rFonts w:ascii="Arial" w:hAnsi="Arial" w:hint="default"/>
+          <w:sz w:val="29"/>
+          <w:szCs w:val="29"/>
+          <w:rtl w:val="0"/>
+          <w:lang w:val="en-US"/>
+        </w:rPr>
+        <w:t>ř</w:t>
+      </w:r>
+      <w:r>
+        <w:rPr>
+          <w:rFonts w:ascii="Arial" w:hAnsi="Arial"/>
+          <w:sz w:val="29"/>
+          <w:szCs w:val="29"/>
+          <w:rtl w:val="0"/>
+          <w:lang w:val="en-US"/>
+        </w:rPr>
+        <w:t>uje arm</w:t>
+      </w:r>
+      <w:r>
+        <w:rPr>
+          <w:rFonts w:ascii="Arial" w:hAnsi="Arial" w:hint="default"/>
+          <w:sz w:val="29"/>
+          <w:szCs w:val="29"/>
+          <w:rtl w:val="0"/>
+          <w:lang w:val="en-US"/>
+        </w:rPr>
+        <w:t>á</w:t>
+      </w:r>
+      <w:r>
+        <w:rPr>
+          <w:rFonts w:ascii="Arial" w:hAnsi="Arial"/>
+          <w:sz w:val="29"/>
+          <w:szCs w:val="29"/>
+          <w:rtl w:val="0"/>
+          <w:lang w:val="en-US"/>
+        </w:rPr>
+        <w:t>du &lt;strong&gt;{frakce}&lt;/strong&gt; o model nebo jednotku,</w:t>
+      </w:r>
+    </w:p>
+    <w:p>
+      <w:pPr>
+        <w:pStyle w:val="Výchozí"/>
+        <w:suppressAutoHyphens w:val="1"/>
+        <w:spacing w:before="0" w:line="240" w:lineRule="auto"/>
+        <w:rPr>
+          <w:rFonts w:ascii="Arial" w:cs="Arial" w:hAnsi="Arial" w:eastAsia="Arial"/>
+          <w:sz w:val="29"/>
+          <w:szCs w:val="29"/>
+        </w:rPr>
+      </w:pPr>
+      <w:r>
+        <w:rPr>
+          <w:rFonts w:ascii="Arial" w:hAnsi="Arial"/>
+          <w:sz w:val="29"/>
+          <w:szCs w:val="29"/>
+          <w:rtl w:val="0"/>
+          <w:lang w:val="en-US"/>
+        </w:rPr>
+        <w:t xml:space="preserve">    kter</w:t>
+      </w:r>
+      <w:r>
+        <w:rPr>
+          <w:rFonts w:ascii="Arial" w:hAnsi="Arial" w:hint="default"/>
+          <w:sz w:val="29"/>
+          <w:szCs w:val="29"/>
+          <w:rtl w:val="0"/>
+          <w:lang w:val="en-US"/>
+        </w:rPr>
+        <w:t xml:space="preserve">á </w:t>
+      </w:r>
+      <w:r>
+        <w:rPr>
+          <w:rFonts w:ascii="Arial" w:hAnsi="Arial"/>
+          <w:sz w:val="29"/>
+          <w:szCs w:val="29"/>
+          <w:rtl w:val="0"/>
+          <w:lang w:val="en-US"/>
+        </w:rPr>
+        <w:t>m</w:t>
+      </w:r>
+      <w:r>
+        <w:rPr>
+          <w:rFonts w:ascii="Arial" w:hAnsi="Arial" w:hint="default"/>
+          <w:sz w:val="29"/>
+          <w:szCs w:val="29"/>
+          <w:rtl w:val="0"/>
+          <w:lang w:val="en-US"/>
+        </w:rPr>
+        <w:t xml:space="preserve">á </w:t>
+      </w:r>
+      <w:r>
+        <w:rPr>
+          <w:rFonts w:ascii="Arial" w:hAnsi="Arial"/>
+          <w:sz w:val="29"/>
+          <w:szCs w:val="29"/>
+          <w:rtl w:val="0"/>
+          <w:lang w:val="en-US"/>
+        </w:rPr>
+        <w:t>na stole jasnou roli a z</w:t>
+      </w:r>
+      <w:r>
+        <w:rPr>
+          <w:rFonts w:ascii="Arial" w:hAnsi="Arial" w:hint="default"/>
+          <w:sz w:val="29"/>
+          <w:szCs w:val="29"/>
+          <w:rtl w:val="0"/>
+          <w:lang w:val="en-US"/>
+        </w:rPr>
+        <w:t>á</w:t>
+      </w:r>
+      <w:r>
+        <w:rPr>
+          <w:rFonts w:ascii="Arial" w:hAnsi="Arial"/>
+          <w:sz w:val="29"/>
+          <w:szCs w:val="29"/>
+          <w:rtl w:val="0"/>
+          <w:lang w:val="en-US"/>
+        </w:rPr>
+        <w:t>rove</w:t>
+      </w:r>
+      <w:r>
+        <w:rPr>
+          <w:rFonts w:ascii="Arial" w:hAnsi="Arial" w:hint="default"/>
+          <w:sz w:val="29"/>
+          <w:szCs w:val="29"/>
+          <w:rtl w:val="0"/>
+          <w:lang w:val="en-US"/>
+        </w:rPr>
+        <w:t xml:space="preserve">ň </w:t>
+      </w:r>
+      <w:r>
+        <w:rPr>
+          <w:rFonts w:ascii="Arial" w:hAnsi="Arial"/>
+          <w:sz w:val="29"/>
+          <w:szCs w:val="29"/>
+          <w:rtl w:val="0"/>
+          <w:lang w:val="en-US"/>
+        </w:rPr>
+        <w:t>v</w:t>
+      </w:r>
+      <w:r>
+        <w:rPr>
+          <w:rFonts w:ascii="Arial" w:hAnsi="Arial" w:hint="default"/>
+          <w:sz w:val="29"/>
+          <w:szCs w:val="29"/>
+          <w:rtl w:val="0"/>
+          <w:lang w:val="en-US"/>
+        </w:rPr>
+        <w:t>ý</w:t>
+      </w:r>
+      <w:r>
+        <w:rPr>
+          <w:rFonts w:ascii="Arial" w:hAnsi="Arial"/>
+          <w:sz w:val="29"/>
+          <w:szCs w:val="29"/>
+          <w:rtl w:val="0"/>
+          <w:lang w:val="en-US"/>
+        </w:rPr>
+        <w:t>raznou vizu</w:t>
+      </w:r>
+      <w:r>
+        <w:rPr>
+          <w:rFonts w:ascii="Arial" w:hAnsi="Arial" w:hint="default"/>
+          <w:sz w:val="29"/>
+          <w:szCs w:val="29"/>
+          <w:rtl w:val="0"/>
+          <w:lang w:val="en-US"/>
+        </w:rPr>
+        <w:t>á</w:t>
+      </w:r>
+      <w:r>
+        <w:rPr>
+          <w:rFonts w:ascii="Arial" w:hAnsi="Arial"/>
+          <w:sz w:val="29"/>
+          <w:szCs w:val="29"/>
+          <w:rtl w:val="0"/>
+          <w:lang w:val="en-US"/>
+        </w:rPr>
+        <w:t>ln</w:t>
+      </w:r>
+      <w:r>
+        <w:rPr>
+          <w:rFonts w:ascii="Arial" w:hAnsi="Arial" w:hint="default"/>
+          <w:sz w:val="29"/>
+          <w:szCs w:val="29"/>
+          <w:rtl w:val="0"/>
+          <w:lang w:val="en-US"/>
+        </w:rPr>
+        <w:t xml:space="preserve">í </w:t>
+      </w:r>
+      <w:r>
+        <w:rPr>
+          <w:rFonts w:ascii="Arial" w:hAnsi="Arial"/>
+          <w:sz w:val="29"/>
+          <w:szCs w:val="29"/>
+          <w:rtl w:val="0"/>
+          <w:lang w:val="en-US"/>
+        </w:rPr>
+        <w:t>identitu ve sb</w:t>
+      </w:r>
+      <w:r>
+        <w:rPr>
+          <w:rFonts w:ascii="Arial" w:hAnsi="Arial" w:hint="default"/>
+          <w:sz w:val="29"/>
+          <w:szCs w:val="29"/>
+          <w:rtl w:val="0"/>
+          <w:lang w:val="en-US"/>
         </w:rPr>
         <w:t>í</w:t>
       </w:r>
@@ -728,16 +945,337 @@
           <w:sz w:val="29"/>
           <w:szCs w:val="29"/>
           <w:rtl w:val="0"/>
-          <w:lang w:val="de-DE"/>
-        </w:rPr>
-        <w:t>ben</w:t>
-      </w:r>
-      <w:r>
-        <w:rPr>
-          <w:rFonts w:ascii="Arial" w:hAnsi="Arial" w:hint="default"/>
-          <w:sz w:val="29"/>
-          <w:szCs w:val="29"/>
-          <w:rtl w:val="0"/>
+          <w:lang w:val="en-US"/>
+        </w:rPr>
+        <w:t>rce.</w:t>
+      </w:r>
+    </w:p>
+    <w:p>
+      <w:pPr>
+        <w:pStyle w:val="Výchozí"/>
+        <w:suppressAutoHyphens w:val="1"/>
+        <w:spacing w:before="0" w:line="240" w:lineRule="auto"/>
+        <w:rPr>
+          <w:rFonts w:ascii="Arial" w:cs="Arial" w:hAnsi="Arial" w:eastAsia="Arial"/>
+          <w:sz w:val="29"/>
+          <w:szCs w:val="29"/>
+        </w:rPr>
+      </w:pPr>
+      <w:r>
+        <w:rPr>
+          <w:rFonts w:ascii="Arial" w:hAnsi="Arial"/>
+          <w:sz w:val="29"/>
+          <w:szCs w:val="29"/>
+          <w:rtl w:val="0"/>
+          <w:lang w:val="en-US"/>
+        </w:rPr>
+        <w:t xml:space="preserve">    D</w:t>
+      </w:r>
+      <w:r>
+        <w:rPr>
+          <w:rFonts w:ascii="Arial" w:hAnsi="Arial" w:hint="default"/>
+          <w:sz w:val="29"/>
+          <w:szCs w:val="29"/>
+          <w:rtl w:val="0"/>
+          <w:lang w:val="en-US"/>
+        </w:rPr>
+        <w:t>í</w:t>
+      </w:r>
+      <w:r>
+        <w:rPr>
+          <w:rFonts w:ascii="Arial" w:hAnsi="Arial"/>
+          <w:sz w:val="29"/>
+          <w:szCs w:val="29"/>
+          <w:rtl w:val="0"/>
+          <w:lang w:val="en-US"/>
+        </w:rPr>
+        <w:t>ky tomu nep</w:t>
+      </w:r>
+      <w:r>
+        <w:rPr>
+          <w:rFonts w:ascii="Arial" w:hAnsi="Arial" w:hint="default"/>
+          <w:sz w:val="29"/>
+          <w:szCs w:val="29"/>
+          <w:rtl w:val="0"/>
+          <w:lang w:val="en-US"/>
+        </w:rPr>
+        <w:t>ů</w:t>
+      </w:r>
+      <w:r>
+        <w:rPr>
+          <w:rFonts w:ascii="Arial" w:hAnsi="Arial"/>
+          <w:sz w:val="29"/>
+          <w:szCs w:val="29"/>
+          <w:rtl w:val="0"/>
+          <w:lang w:val="en-US"/>
+        </w:rPr>
+        <w:t>sob</w:t>
+      </w:r>
+      <w:r>
+        <w:rPr>
+          <w:rFonts w:ascii="Arial" w:hAnsi="Arial" w:hint="default"/>
+          <w:sz w:val="29"/>
+          <w:szCs w:val="29"/>
+          <w:rtl w:val="0"/>
+          <w:lang w:val="en-US"/>
+        </w:rPr>
+        <w:t xml:space="preserve">í </w:t>
+      </w:r>
+      <w:r>
+        <w:rPr>
+          <w:rFonts w:ascii="Arial" w:hAnsi="Arial"/>
+          <w:sz w:val="29"/>
+          <w:szCs w:val="29"/>
+          <w:rtl w:val="0"/>
+          <w:lang w:val="en-US"/>
+        </w:rPr>
+        <w:t>jen jako dal</w:t>
+      </w:r>
+      <w:r>
+        <w:rPr>
+          <w:rFonts w:ascii="Arial" w:hAnsi="Arial" w:hint="default"/>
+          <w:sz w:val="29"/>
+          <w:szCs w:val="29"/>
+          <w:rtl w:val="0"/>
+          <w:lang w:val="en-US"/>
+        </w:rPr>
+        <w:t xml:space="preserve">ší </w:t>
+      </w:r>
+      <w:r>
+        <w:rPr>
+          <w:rFonts w:ascii="Arial" w:hAnsi="Arial"/>
+          <w:sz w:val="29"/>
+          <w:szCs w:val="29"/>
+          <w:rtl w:val="0"/>
+          <w:lang w:val="en-US"/>
+        </w:rPr>
+        <w:t>kus do arm</w:t>
+      </w:r>
+      <w:r>
+        <w:rPr>
+          <w:rFonts w:ascii="Arial" w:hAnsi="Arial" w:hint="default"/>
+          <w:sz w:val="29"/>
+          <w:szCs w:val="29"/>
+          <w:rtl w:val="0"/>
+          <w:lang w:val="en-US"/>
+        </w:rPr>
+        <w:t>á</w:t>
+      </w:r>
+      <w:r>
+        <w:rPr>
+          <w:rFonts w:ascii="Arial" w:hAnsi="Arial"/>
+          <w:sz w:val="29"/>
+          <w:szCs w:val="29"/>
+          <w:rtl w:val="0"/>
+          <w:lang w:val="en-US"/>
+        </w:rPr>
+        <w:t>dy, ale jako prvek, kter</w:t>
+      </w:r>
+      <w:r>
+        <w:rPr>
+          <w:rFonts w:ascii="Arial" w:hAnsi="Arial" w:hint="default"/>
+          <w:sz w:val="29"/>
+          <w:szCs w:val="29"/>
+          <w:rtl w:val="0"/>
+          <w:lang w:val="en-US"/>
+        </w:rPr>
+        <w:t xml:space="preserve">ý </w:t>
+      </w:r>
+      <w:r>
+        <w:rPr>
+          <w:rFonts w:ascii="Arial" w:hAnsi="Arial"/>
+          <w:sz w:val="29"/>
+          <w:szCs w:val="29"/>
+          <w:rtl w:val="0"/>
+          <w:lang w:val="en-US"/>
+        </w:rPr>
+        <w:t>ji skute</w:t>
+      </w:r>
+      <w:r>
+        <w:rPr>
+          <w:rFonts w:ascii="Arial" w:hAnsi="Arial" w:hint="default"/>
+          <w:sz w:val="29"/>
+          <w:szCs w:val="29"/>
+          <w:rtl w:val="0"/>
+          <w:lang w:val="en-US"/>
+        </w:rPr>
+        <w:t>č</w:t>
+      </w:r>
+      <w:r>
+        <w:rPr>
+          <w:rFonts w:ascii="Arial" w:hAnsi="Arial"/>
+          <w:sz w:val="29"/>
+          <w:szCs w:val="29"/>
+          <w:rtl w:val="0"/>
+          <w:lang w:val="en-US"/>
+        </w:rPr>
+        <w:t>n</w:t>
+      </w:r>
+      <w:r>
+        <w:rPr>
+          <w:rFonts w:ascii="Arial" w:hAnsi="Arial" w:hint="default"/>
+          <w:sz w:val="29"/>
+          <w:szCs w:val="29"/>
+          <w:rtl w:val="0"/>
+          <w:lang w:val="en-US"/>
+        </w:rPr>
+        <w:t xml:space="preserve">ě </w:t>
+      </w:r>
+      <w:r>
+        <w:rPr>
+          <w:rFonts w:ascii="Arial" w:hAnsi="Arial"/>
+          <w:sz w:val="29"/>
+          <w:szCs w:val="29"/>
+          <w:rtl w:val="0"/>
+          <w:lang w:val="en-US"/>
+        </w:rPr>
+        <w:t>dopl</w:t>
+      </w:r>
+      <w:r>
+        <w:rPr>
+          <w:rFonts w:ascii="Arial" w:hAnsi="Arial" w:hint="default"/>
+          <w:sz w:val="29"/>
+          <w:szCs w:val="29"/>
+          <w:rtl w:val="0"/>
+          <w:lang w:val="en-US"/>
+        </w:rPr>
+        <w:t>ň</w:t>
+      </w:r>
+      <w:r>
+        <w:rPr>
+          <w:rFonts w:ascii="Arial" w:hAnsi="Arial"/>
+          <w:sz w:val="29"/>
+          <w:szCs w:val="29"/>
+          <w:rtl w:val="0"/>
+          <w:lang w:val="en-US"/>
+        </w:rPr>
+        <w:t>uje.</w:t>
+      </w:r>
+    </w:p>
+    <w:p>
+      <w:pPr>
+        <w:pStyle w:val="Výchozí"/>
+        <w:suppressAutoHyphens w:val="1"/>
+        <w:spacing w:before="0" w:line="240" w:lineRule="auto"/>
+        <w:rPr>
+          <w:rFonts w:ascii="Arial" w:cs="Arial" w:hAnsi="Arial" w:eastAsia="Arial"/>
+          <w:sz w:val="29"/>
+          <w:szCs w:val="29"/>
+        </w:rPr>
+      </w:pPr>
+      <w:r>
+        <w:rPr>
+          <w:rFonts w:ascii="Arial" w:hAnsi="Arial"/>
+          <w:sz w:val="29"/>
+          <w:szCs w:val="29"/>
+          <w:rtl w:val="0"/>
+          <w:lang w:val="en-US"/>
+        </w:rPr>
+        <w:t xml:space="preserve">  &lt;/p&gt;</w:t>
+      </w:r>
+    </w:p>
+    <w:p>
+      <w:pPr>
+        <w:pStyle w:val="Výchozí"/>
+        <w:suppressAutoHyphens w:val="1"/>
+        <w:spacing w:before="0" w:line="240" w:lineRule="auto"/>
+        <w:rPr>
+          <w:rFonts w:ascii="Arial" w:cs="Arial" w:hAnsi="Arial" w:eastAsia="Arial"/>
+          <w:sz w:val="29"/>
+          <w:szCs w:val="29"/>
+        </w:rPr>
+      </w:pPr>
+    </w:p>
+    <w:p>
+      <w:pPr>
+        <w:pStyle w:val="Výchozí"/>
+        <w:suppressAutoHyphens w:val="1"/>
+        <w:spacing w:before="0" w:line="240" w:lineRule="auto"/>
+        <w:rPr>
+          <w:rFonts w:ascii="Arial" w:cs="Arial" w:hAnsi="Arial" w:eastAsia="Arial"/>
+          <w:sz w:val="29"/>
+          <w:szCs w:val="29"/>
+        </w:rPr>
+      </w:pPr>
+      <w:r>
+        <w:rPr>
+          <w:rFonts w:ascii="Arial" w:hAnsi="Arial"/>
+          <w:sz w:val="29"/>
+          <w:szCs w:val="29"/>
+          <w:rtl w:val="0"/>
+          <w:lang w:val="en-US"/>
+        </w:rPr>
+        <w:t xml:space="preserve">  &lt;p&gt;</w:t>
+      </w:r>
+    </w:p>
+    <w:p>
+      <w:pPr>
+        <w:pStyle w:val="Výchozí"/>
+        <w:suppressAutoHyphens w:val="1"/>
+        <w:spacing w:before="0" w:line="240" w:lineRule="auto"/>
+        <w:rPr>
+          <w:rFonts w:ascii="Arial" w:cs="Arial" w:hAnsi="Arial" w:eastAsia="Arial"/>
+          <w:sz w:val="29"/>
+          <w:szCs w:val="29"/>
+        </w:rPr>
+      </w:pPr>
+      <w:r>
+        <w:rPr>
+          <w:rFonts w:ascii="Arial" w:hAnsi="Arial"/>
+          <w:sz w:val="29"/>
+          <w:szCs w:val="29"/>
+          <w:rtl w:val="0"/>
+          <w:lang w:val="en-US"/>
+        </w:rPr>
+        <w:t xml:space="preserve">    &lt;strong&gt;Pro</w:t>
+      </w:r>
+      <w:r>
+        <w:rPr>
+          <w:rFonts w:ascii="Arial" w:hAnsi="Arial" w:hint="default"/>
+          <w:sz w:val="29"/>
+          <w:szCs w:val="29"/>
+          <w:rtl w:val="0"/>
+          <w:lang w:val="en-US"/>
+        </w:rPr>
+        <w:t xml:space="preserve">č </w:t>
+      </w:r>
+      <w:r>
+        <w:rPr>
+          <w:rFonts w:ascii="Arial" w:hAnsi="Arial"/>
+          <w:sz w:val="29"/>
+          <w:szCs w:val="29"/>
+          <w:rtl w:val="0"/>
+          <w:lang w:val="en-US"/>
+        </w:rPr>
+        <w:t>d</w:t>
+      </w:r>
+      <w:r>
+        <w:rPr>
+          <w:rFonts w:ascii="Arial" w:hAnsi="Arial" w:hint="default"/>
+          <w:sz w:val="29"/>
+          <w:szCs w:val="29"/>
+          <w:rtl w:val="0"/>
+          <w:lang w:val="en-US"/>
+        </w:rPr>
+        <w:t>á</w:t>
+      </w:r>
+      <w:r>
+        <w:rPr>
+          <w:rFonts w:ascii="Arial" w:hAnsi="Arial"/>
+          <w:sz w:val="29"/>
+          <w:szCs w:val="29"/>
+          <w:rtl w:val="0"/>
+          <w:lang w:val="en-US"/>
+        </w:rPr>
+        <w:t>v</w:t>
+      </w:r>
+      <w:r>
+        <w:rPr>
+          <w:rFonts w:ascii="Arial" w:hAnsi="Arial" w:hint="default"/>
+          <w:sz w:val="29"/>
+          <w:szCs w:val="29"/>
+          <w:rtl w:val="0"/>
+          <w:lang w:val="en-US"/>
         </w:rPr>
         <w:t xml:space="preserve">á </w:t>
       </w:r>
@@ -747,63 +1285,201 @@
           <w:sz w:val="29"/>
           <w:szCs w:val="29"/>
           <w:rtl w:val="0"/>
-        </w:rPr>
-        <w:t>volba mezi hr</w:t>
-      </w:r>
-      <w:r>
-        <w:rPr>
-          <w:rFonts w:ascii="Arial" w:hAnsi="Arial" w:hint="default"/>
-          <w:sz w:val="29"/>
-          <w:szCs w:val="29"/>
-          <w:rtl w:val="0"/>
-        </w:rPr>
-        <w:t>áč</w:t>
-      </w:r>
-      <w:r>
-        <w:rPr>
-          <w:rFonts w:ascii="Arial" w:hAnsi="Arial"/>
-          <w:sz w:val="29"/>
-          <w:szCs w:val="29"/>
-          <w:rtl w:val="0"/>
-        </w:rPr>
-        <w:t>i frakce &lt;strong&gt;{frakce}&lt;/strong&gt;.</w:t>
-      </w:r>
-    </w:p>
-    <w:p>
-      <w:pPr>
-        <w:pStyle w:val="Výchozí"/>
-        <w:suppressAutoHyphens w:val="1"/>
-        <w:spacing w:before="0" w:line="240" w:lineRule="auto"/>
-        <w:rPr>
-          <w:rFonts w:ascii="Times Roman" w:cs="Times Roman" w:hAnsi="Times Roman" w:eastAsia="Times Roman"/>
-          <w:sz w:val="24"/>
-          <w:szCs w:val="24"/>
-        </w:rPr>
-      </w:pPr>
-      <w:r>
-        <w:rPr>
-          <w:rFonts w:ascii="Arial" w:hAnsi="Arial" w:hint="default"/>
-          <w:sz w:val="29"/>
-          <w:szCs w:val="29"/>
-          <w:rtl w:val="0"/>
-        </w:rPr>
-        <w:t>    </w:t>
-      </w:r>
-      <w:r>
-        <w:rPr>
-          <w:rFonts w:ascii="Arial" w:hAnsi="Arial"/>
-          <w:sz w:val="29"/>
-          <w:szCs w:val="29"/>
-          <w:rtl w:val="0"/>
-        </w:rPr>
-        <w:t>Ke hran</w:t>
-      </w:r>
-      <w:r>
-        <w:rPr>
-          <w:rFonts w:ascii="Arial" w:hAnsi="Arial" w:hint="default"/>
-          <w:sz w:val="29"/>
-          <w:szCs w:val="29"/>
-          <w:rtl w:val="0"/>
+          <w:lang w:val="en-US"/>
+        </w:rPr>
+        <w:t>smysl m</w:t>
+      </w:r>
+      <w:r>
+        <w:rPr>
+          <w:rFonts w:ascii="Arial" w:hAnsi="Arial" w:hint="default"/>
+          <w:sz w:val="29"/>
+          <w:szCs w:val="29"/>
+          <w:rtl w:val="0"/>
+          <w:lang w:val="en-US"/>
+        </w:rPr>
+        <w:t>í</w:t>
+      </w:r>
+      <w:r>
+        <w:rPr>
+          <w:rFonts w:ascii="Arial" w:hAnsi="Arial"/>
+          <w:sz w:val="29"/>
+          <w:szCs w:val="29"/>
+          <w:rtl w:val="0"/>
+          <w:lang w:val="en-US"/>
+        </w:rPr>
+        <w:t>t tento set ve sb</w:t>
+      </w:r>
+      <w:r>
+        <w:rPr>
+          <w:rFonts w:ascii="Arial" w:hAnsi="Arial" w:hint="default"/>
+          <w:sz w:val="29"/>
+          <w:szCs w:val="29"/>
+          <w:rtl w:val="0"/>
+          <w:lang w:val="en-US"/>
+        </w:rPr>
+        <w:t>í</w:t>
+      </w:r>
+      <w:r>
+        <w:rPr>
+          <w:rFonts w:ascii="Arial" w:hAnsi="Arial"/>
+          <w:sz w:val="29"/>
+          <w:szCs w:val="29"/>
+          <w:rtl w:val="0"/>
+          <w:lang w:val="en-US"/>
+        </w:rPr>
+        <w:t>rce?&lt;/strong&gt;&lt;br&gt;</w:t>
+      </w:r>
+    </w:p>
+    <w:p>
+      <w:pPr>
+        <w:pStyle w:val="Výchozí"/>
+        <w:suppressAutoHyphens w:val="1"/>
+        <w:spacing w:before="0" w:line="240" w:lineRule="auto"/>
+        <w:rPr>
+          <w:rFonts w:ascii="Arial" w:cs="Arial" w:hAnsi="Arial" w:eastAsia="Arial"/>
+          <w:sz w:val="29"/>
+          <w:szCs w:val="29"/>
+        </w:rPr>
+      </w:pPr>
+      <w:r>
+        <w:rPr>
+          <w:rFonts w:ascii="Arial" w:hAnsi="Arial"/>
+          <w:sz w:val="29"/>
+          <w:szCs w:val="29"/>
+          <w:rtl w:val="0"/>
+          <w:lang w:val="en-US"/>
+        </w:rPr>
+        <w:t xml:space="preserve">    {hlavni_prodejni_point_1}.&lt;br&gt;</w:t>
+      </w:r>
+    </w:p>
+    <w:p>
+      <w:pPr>
+        <w:pStyle w:val="Výchozí"/>
+        <w:suppressAutoHyphens w:val="1"/>
+        <w:spacing w:before="0" w:line="240" w:lineRule="auto"/>
+        <w:rPr>
+          <w:rFonts w:ascii="Arial" w:cs="Arial" w:hAnsi="Arial" w:eastAsia="Arial"/>
+          <w:sz w:val="29"/>
+          <w:szCs w:val="29"/>
+        </w:rPr>
+      </w:pPr>
+      <w:r>
+        <w:rPr>
+          <w:rFonts w:ascii="Arial" w:hAnsi="Arial"/>
+          <w:sz w:val="29"/>
+          <w:szCs w:val="29"/>
+          <w:rtl w:val="0"/>
+          <w:lang w:val="en-US"/>
+        </w:rPr>
+        <w:t xml:space="preserve">    {hlavni_prodejni_point_2}.&lt;br&gt;</w:t>
+      </w:r>
+    </w:p>
+    <w:p>
+      <w:pPr>
+        <w:pStyle w:val="Výchozí"/>
+        <w:suppressAutoHyphens w:val="1"/>
+        <w:spacing w:before="0" w:line="240" w:lineRule="auto"/>
+        <w:rPr>
+          <w:rFonts w:ascii="Arial" w:cs="Arial" w:hAnsi="Arial" w:eastAsia="Arial"/>
+          <w:sz w:val="29"/>
+          <w:szCs w:val="29"/>
+        </w:rPr>
+      </w:pPr>
+      <w:r>
+        <w:rPr>
+          <w:rFonts w:ascii="Arial" w:hAnsi="Arial"/>
+          <w:sz w:val="29"/>
+          <w:szCs w:val="29"/>
+          <w:rtl w:val="0"/>
+          <w:lang w:val="en-US"/>
+        </w:rPr>
+        <w:t xml:space="preserve">    {hlavni_prodejni_point_3}.</w:t>
+      </w:r>
+    </w:p>
+    <w:p>
+      <w:pPr>
+        <w:pStyle w:val="Výchozí"/>
+        <w:suppressAutoHyphens w:val="1"/>
+        <w:spacing w:before="0" w:line="240" w:lineRule="auto"/>
+        <w:rPr>
+          <w:rFonts w:ascii="Arial" w:cs="Arial" w:hAnsi="Arial" w:eastAsia="Arial"/>
+          <w:sz w:val="29"/>
+          <w:szCs w:val="29"/>
+        </w:rPr>
+      </w:pPr>
+      <w:r>
+        <w:rPr>
+          <w:rFonts w:ascii="Arial" w:hAnsi="Arial"/>
+          <w:sz w:val="29"/>
+          <w:szCs w:val="29"/>
+          <w:rtl w:val="0"/>
+          <w:lang w:val="en-US"/>
+        </w:rPr>
+        <w:t xml:space="preserve">  &lt;/p&gt;</w:t>
+      </w:r>
+    </w:p>
+    <w:p>
+      <w:pPr>
+        <w:pStyle w:val="Výchozí"/>
+        <w:suppressAutoHyphens w:val="1"/>
+        <w:spacing w:before="0" w:line="240" w:lineRule="auto"/>
+        <w:rPr>
+          <w:rFonts w:ascii="Arial" w:cs="Arial" w:hAnsi="Arial" w:eastAsia="Arial"/>
+          <w:sz w:val="29"/>
+          <w:szCs w:val="29"/>
+        </w:rPr>
+      </w:pPr>
+    </w:p>
+    <w:p>
+      <w:pPr>
+        <w:pStyle w:val="Výchozí"/>
+        <w:suppressAutoHyphens w:val="1"/>
+        <w:spacing w:before="0" w:line="240" w:lineRule="auto"/>
+        <w:rPr>
+          <w:rFonts w:ascii="Arial" w:cs="Arial" w:hAnsi="Arial" w:eastAsia="Arial"/>
+          <w:sz w:val="29"/>
+          <w:szCs w:val="29"/>
+        </w:rPr>
+      </w:pPr>
+      <w:r>
+        <w:rPr>
+          <w:rFonts w:ascii="Arial" w:hAnsi="Arial"/>
+          <w:sz w:val="29"/>
+          <w:szCs w:val="29"/>
+          <w:rtl w:val="0"/>
+          <w:lang w:val="en-US"/>
+        </w:rPr>
+        <w:t xml:space="preserve">  &lt;p&gt;</w:t>
+      </w:r>
+    </w:p>
+    <w:p>
+      <w:pPr>
+        <w:pStyle w:val="Výchozí"/>
+        <w:suppressAutoHyphens w:val="1"/>
+        <w:spacing w:before="0" w:line="240" w:lineRule="auto"/>
+        <w:rPr>
+          <w:rFonts w:ascii="Arial" w:cs="Arial" w:hAnsi="Arial" w:eastAsia="Arial"/>
+          <w:sz w:val="29"/>
+          <w:szCs w:val="29"/>
+        </w:rPr>
+      </w:pPr>
+      <w:r>
+        <w:rPr>
+          <w:rFonts w:ascii="Arial" w:hAnsi="Arial"/>
+          <w:sz w:val="29"/>
+          <w:szCs w:val="29"/>
+          <w:rtl w:val="0"/>
+          <w:lang w:val="en-US"/>
+        </w:rPr>
+        <w:t xml:space="preserve">    Pro nasazen</w:t>
+      </w:r>
+      <w:r>
+        <w:rPr>
+          <w:rFonts w:ascii="Arial" w:hAnsi="Arial" w:hint="default"/>
+          <w:sz w:val="29"/>
+          <w:szCs w:val="29"/>
+          <w:rtl w:val="0"/>
+          <w:lang w:val="en-US"/>
         </w:rPr>
         <w:t xml:space="preserve">í </w:t>
       </w:r>
@@ -813,15 +1489,17 @@
           <w:sz w:val="29"/>
           <w:szCs w:val="29"/>
           <w:rtl w:val="0"/>
-        </w:rPr>
-        <w:t>sta</w:t>
-      </w:r>
-      <w:r>
-        <w:rPr>
-          <w:rFonts w:ascii="Arial" w:hAnsi="Arial" w:hint="default"/>
-          <w:sz w:val="29"/>
-          <w:szCs w:val="29"/>
-          <w:rtl w:val="0"/>
+          <w:lang w:val="en-US"/>
+        </w:rPr>
+        <w:t>do hry ti sta</w:t>
+      </w:r>
+      <w:r>
+        <w:rPr>
+          <w:rFonts w:ascii="Arial" w:hAnsi="Arial" w:hint="default"/>
+          <w:sz w:val="29"/>
+          <w:szCs w:val="29"/>
+          <w:rtl w:val="0"/>
+          <w:lang w:val="en-US"/>
         </w:rPr>
         <w:t xml:space="preserve">čí </w:t>
       </w:r>
@@ -831,15 +1509,17 @@
           <w:sz w:val="29"/>
           <w:szCs w:val="29"/>
           <w:rtl w:val="0"/>
-        </w:rPr>
-        <w:t>pouze &lt;strong&gt;{pot</w:t>
-      </w:r>
-      <w:r>
-        <w:rPr>
-          <w:rFonts w:ascii="Arial" w:hAnsi="Arial" w:hint="default"/>
-          <w:sz w:val="29"/>
-          <w:szCs w:val="29"/>
-          <w:rtl w:val="0"/>
+          <w:lang w:val="en-US"/>
+        </w:rPr>
+        <w:t>&lt;strong&gt;{pot</w:t>
+      </w:r>
+      <w:r>
+        <w:rPr>
+          <w:rFonts w:ascii="Arial" w:hAnsi="Arial" w:hint="default"/>
+          <w:sz w:val="29"/>
+          <w:szCs w:val="29"/>
+          <w:rtl w:val="0"/>
+          <w:lang w:val="en-US"/>
         </w:rPr>
         <w:t>ř</w:t>
       </w:r>
@@ -849,6 +1529,7 @@
           <w:sz w:val="29"/>
           <w:szCs w:val="29"/>
           <w:rtl w:val="0"/>
+          <w:lang w:val="en-US"/>
         </w:rPr>
         <w:t>ebn</w:t>
       </w:r>
@@ -858,7 +1539,7 @@
           <w:sz w:val="29"/>
           <w:szCs w:val="29"/>
           <w:rtl w:val="0"/>
-          <w:lang w:val="fr-FR"/>
+          <w:lang w:val="en-US"/>
         </w:rPr>
         <w:t>é</w:t>
       </w:r>
@@ -868,6 +1549,7 @@
           <w:sz w:val="29"/>
           <w:szCs w:val="29"/>
           <w:rtl w:val="0"/>
+          <w:lang w:val="en-US"/>
         </w:rPr>
         <w:t>_vybaven</w:t>
       </w:r>
@@ -877,6 +1559,7 @@
           <w:sz w:val="29"/>
           <w:szCs w:val="29"/>
           <w:rtl w:val="0"/>
+          <w:lang w:val="en-US"/>
         </w:rPr>
         <w:t>í</w:t>
       </w:r>
@@ -886,134 +1569,119 @@
           <w:sz w:val="29"/>
           <w:szCs w:val="29"/>
           <w:rtl w:val="0"/>
-        </w:rPr>
-        <w:t>}&lt;/strong&gt;.</w:t>
-      </w:r>
-    </w:p>
-    <w:p>
-      <w:pPr>
-        <w:pStyle w:val="Výchozí"/>
-        <w:suppressAutoHyphens w:val="1"/>
-        <w:spacing w:before="0" w:line="240" w:lineRule="auto"/>
-        <w:rPr>
-          <w:rFonts w:ascii="Times Roman" w:cs="Times Roman" w:hAnsi="Times Roman" w:eastAsia="Times Roman"/>
-          <w:sz w:val="24"/>
-          <w:szCs w:val="24"/>
-        </w:rPr>
-      </w:pPr>
-      <w:r>
-        <w:rPr>
-          <w:rFonts w:ascii="Arial" w:hAnsi="Arial" w:hint="default"/>
-          <w:sz w:val="29"/>
-          <w:szCs w:val="29"/>
-          <w:rtl w:val="0"/>
-        </w:rPr>
-        <w:t>  </w:t>
-      </w:r>
-      <w:r>
-        <w:rPr>
-          <w:rFonts w:ascii="Arial" w:hAnsi="Arial"/>
-          <w:sz w:val="29"/>
-          <w:szCs w:val="29"/>
-          <w:rtl w:val="0"/>
-          <w:lang w:val="en-US"/>
-        </w:rPr>
-        <w:t>&lt;/p&gt;</w:t>
-      </w:r>
-    </w:p>
-    <w:p>
-      <w:pPr>
-        <w:pStyle w:val="Výchozí"/>
-        <w:suppressAutoHyphens w:val="1"/>
-        <w:spacing w:before="0" w:line="240" w:lineRule="auto"/>
-        <w:rPr>
-          <w:rFonts w:ascii="Times Roman" w:cs="Times Roman" w:hAnsi="Times Roman" w:eastAsia="Times Roman"/>
-        </w:rPr>
-      </w:pPr>
-    </w:p>
-    <w:p>
-      <w:pPr>
-        <w:pStyle w:val="Výchozí"/>
-        <w:suppressAutoHyphens w:val="1"/>
-        <w:spacing w:before="0" w:line="240" w:lineRule="auto"/>
-        <w:rPr>
-          <w:rFonts w:ascii="Times Roman" w:cs="Times Roman" w:hAnsi="Times Roman" w:eastAsia="Times Roman"/>
-          <w:sz w:val="24"/>
-          <w:szCs w:val="24"/>
-        </w:rPr>
-      </w:pPr>
-      <w:r>
-        <w:rPr>
-          <w:rFonts w:ascii="Arial" w:hAnsi="Arial" w:hint="default"/>
-          <w:sz w:val="29"/>
-          <w:szCs w:val="29"/>
-          <w:rtl w:val="0"/>
-        </w:rPr>
-        <w:t>  </w:t>
-      </w:r>
-      <w:r>
-        <w:rPr>
-          <w:rFonts w:ascii="Arial" w:hAnsi="Arial"/>
-          <w:sz w:val="29"/>
-          <w:szCs w:val="29"/>
-          <w:rtl w:val="0"/>
-        </w:rPr>
-        <w:t>&lt;p&gt;</w:t>
-      </w:r>
-    </w:p>
-    <w:p>
-      <w:pPr>
-        <w:pStyle w:val="Výchozí"/>
-        <w:suppressAutoHyphens w:val="1"/>
-        <w:spacing w:before="0" w:line="240" w:lineRule="auto"/>
-        <w:rPr>
-          <w:rFonts w:ascii="Times Roman" w:cs="Times Roman" w:hAnsi="Times Roman" w:eastAsia="Times Roman"/>
-          <w:sz w:val="24"/>
-          <w:szCs w:val="24"/>
-        </w:rPr>
-      </w:pPr>
-      <w:r>
-        <w:rPr>
-          <w:rFonts w:ascii="Arial" w:hAnsi="Arial" w:hint="default"/>
-          <w:sz w:val="29"/>
-          <w:szCs w:val="29"/>
-          <w:rtl w:val="0"/>
-        </w:rPr>
-        <w:t>    </w:t>
-      </w:r>
-      <w:r>
-        <w:rPr>
-          <w:rFonts w:ascii="Arial" w:hAnsi="Arial"/>
-          <w:sz w:val="29"/>
-          <w:szCs w:val="29"/>
-          <w:rtl w:val="0"/>
-        </w:rPr>
-        <w:t>&lt;strong&gt;Pro</w:t>
-      </w:r>
-      <w:r>
-        <w:rPr>
-          <w:rFonts w:ascii="Arial" w:hAnsi="Arial" w:hint="default"/>
-          <w:sz w:val="29"/>
-          <w:szCs w:val="29"/>
-          <w:rtl w:val="0"/>
-        </w:rPr>
-        <w:t xml:space="preserve">č </w:t>
-      </w:r>
-      <w:r>
-        <w:rPr>
-          <w:rFonts w:ascii="Arial" w:hAnsi="Arial"/>
-          <w:sz w:val="29"/>
-          <w:szCs w:val="29"/>
-          <w:rtl w:val="0"/>
-        </w:rPr>
-        <w:t>si vybrat pr</w:t>
-      </w:r>
-      <w:r>
-        <w:rPr>
-          <w:rFonts w:ascii="Arial" w:hAnsi="Arial" w:hint="default"/>
-          <w:sz w:val="29"/>
-          <w:szCs w:val="29"/>
-          <w:rtl w:val="0"/>
+          <w:lang w:val="en-US"/>
+        </w:rPr>
+        <w:t>}&lt;/strong&gt;,</w:t>
+      </w:r>
+    </w:p>
+    <w:p>
+      <w:pPr>
+        <w:pStyle w:val="Výchozí"/>
+        <w:suppressAutoHyphens w:val="1"/>
+        <w:spacing w:before="0" w:line="240" w:lineRule="auto"/>
+        <w:rPr>
+          <w:rFonts w:ascii="Arial" w:cs="Arial" w:hAnsi="Arial" w:eastAsia="Arial"/>
+          <w:sz w:val="29"/>
+          <w:szCs w:val="29"/>
+        </w:rPr>
+      </w:pPr>
+      <w:r>
+        <w:rPr>
+          <w:rFonts w:ascii="Arial" w:hAnsi="Arial"/>
+          <w:sz w:val="29"/>
+          <w:szCs w:val="29"/>
+          <w:rtl w:val="0"/>
+          <w:lang w:val="en-US"/>
+        </w:rPr>
+        <w:t xml:space="preserve">    tak</w:t>
+      </w:r>
+      <w:r>
+        <w:rPr>
+          <w:rFonts w:ascii="Arial" w:hAnsi="Arial" w:hint="default"/>
+          <w:sz w:val="29"/>
+          <w:szCs w:val="29"/>
+          <w:rtl w:val="0"/>
+          <w:lang w:val="en-US"/>
+        </w:rPr>
+        <w:t>ž</w:t>
+      </w:r>
+      <w:r>
+        <w:rPr>
+          <w:rFonts w:ascii="Arial" w:hAnsi="Arial"/>
+          <w:sz w:val="29"/>
+          <w:szCs w:val="29"/>
+          <w:rtl w:val="0"/>
+          <w:lang w:val="en-US"/>
+        </w:rPr>
+        <w:t>e m</w:t>
+      </w:r>
+      <w:r>
+        <w:rPr>
+          <w:rFonts w:ascii="Arial" w:hAnsi="Arial" w:hint="default"/>
+          <w:sz w:val="29"/>
+          <w:szCs w:val="29"/>
+          <w:rtl w:val="0"/>
+          <w:lang w:val="en-US"/>
+        </w:rPr>
+        <w:t>ůž</w:t>
+      </w:r>
+      <w:r>
+        <w:rPr>
+          <w:rFonts w:ascii="Arial" w:hAnsi="Arial"/>
+          <w:sz w:val="29"/>
+          <w:szCs w:val="29"/>
+          <w:rtl w:val="0"/>
+          <w:lang w:val="en-US"/>
+        </w:rPr>
+        <w:t>e</w:t>
+      </w:r>
+      <w:r>
+        <w:rPr>
+          <w:rFonts w:ascii="Arial" w:hAnsi="Arial" w:hint="default"/>
+          <w:sz w:val="29"/>
+          <w:szCs w:val="29"/>
+          <w:rtl w:val="0"/>
+          <w:lang w:val="en-US"/>
+        </w:rPr>
+        <w:t xml:space="preserve">š </w:t>
+      </w:r>
+      <w:r>
+        <w:rPr>
+          <w:rFonts w:ascii="Arial" w:hAnsi="Arial"/>
+          <w:sz w:val="29"/>
+          <w:szCs w:val="29"/>
+          <w:rtl w:val="0"/>
+          <w:lang w:val="en-US"/>
+        </w:rPr>
+        <w:t>model rychle zapojit do sv</w:t>
+      </w:r>
+      <w:r>
+        <w:rPr>
+          <w:rFonts w:ascii="Arial" w:hAnsi="Arial" w:hint="default"/>
+          <w:sz w:val="29"/>
+          <w:szCs w:val="29"/>
+          <w:rtl w:val="0"/>
+          <w:lang w:val="en-US"/>
+        </w:rPr>
+        <w:t xml:space="preserve">é </w:t>
+      </w:r>
+      <w:r>
+        <w:rPr>
+          <w:rFonts w:ascii="Arial" w:hAnsi="Arial"/>
+          <w:sz w:val="29"/>
+          <w:szCs w:val="29"/>
+          <w:rtl w:val="0"/>
+          <w:lang w:val="en-US"/>
+        </w:rPr>
+        <w:t>arm</w:t>
+      </w:r>
+      <w:r>
+        <w:rPr>
+          <w:rFonts w:ascii="Arial" w:hAnsi="Arial" w:hint="default"/>
+          <w:sz w:val="29"/>
+          <w:szCs w:val="29"/>
+          <w:rtl w:val="0"/>
+          <w:lang w:val="en-US"/>
         </w:rPr>
         <w:t>á</w:t>
       </w:r>
@@ -1023,225 +1691,155 @@
           <w:sz w:val="29"/>
           <w:szCs w:val="29"/>
           <w:rtl w:val="0"/>
-        </w:rPr>
-        <w:t>v</w:t>
-      </w:r>
-      <w:r>
-        <w:rPr>
-          <w:rFonts w:ascii="Arial" w:hAnsi="Arial" w:hint="default"/>
-          <w:sz w:val="29"/>
-          <w:szCs w:val="29"/>
-          <w:rtl w:val="0"/>
-        </w:rPr>
-        <w:t xml:space="preserve">ě </w:t>
-      </w:r>
-      <w:r>
-        <w:rPr>
-          <w:rFonts w:ascii="Arial" w:hAnsi="Arial"/>
-          <w:sz w:val="29"/>
-          <w:szCs w:val="29"/>
-          <w:rtl w:val="0"/>
-          <w:lang w:val="en-US"/>
-        </w:rPr>
-        <w:t>tento set?&lt;/strong&gt;&lt;br&gt;</w:t>
-      </w:r>
-    </w:p>
-    <w:p>
-      <w:pPr>
-        <w:pStyle w:val="Výchozí"/>
-        <w:suppressAutoHyphens w:val="1"/>
-        <w:spacing w:before="0" w:line="240" w:lineRule="auto"/>
-        <w:rPr>
-          <w:rFonts w:ascii="Times Roman" w:cs="Times Roman" w:hAnsi="Times Roman" w:eastAsia="Times Roman"/>
-          <w:sz w:val="24"/>
-          <w:szCs w:val="24"/>
-        </w:rPr>
-      </w:pPr>
-      <w:r>
-        <w:rPr>
-          <w:rFonts w:ascii="Arial" w:hAnsi="Arial" w:hint="default"/>
-          <w:sz w:val="29"/>
-          <w:szCs w:val="29"/>
-          <w:rtl w:val="0"/>
-        </w:rPr>
-        <w:t>    </w:t>
-      </w:r>
-      <w:r>
-        <w:rPr>
-          <w:rFonts w:ascii="Arial" w:hAnsi="Arial"/>
-          <w:sz w:val="29"/>
-          <w:szCs w:val="29"/>
-          <w:rtl w:val="0"/>
-        </w:rPr>
-        <w:t>{hlavni_prodejni_point_1}.&lt;br&gt;</w:t>
-      </w:r>
-    </w:p>
-    <w:p>
-      <w:pPr>
-        <w:pStyle w:val="Výchozí"/>
-        <w:suppressAutoHyphens w:val="1"/>
-        <w:spacing w:before="0" w:line="240" w:lineRule="auto"/>
-        <w:rPr>
-          <w:rFonts w:ascii="Times Roman" w:cs="Times Roman" w:hAnsi="Times Roman" w:eastAsia="Times Roman"/>
-          <w:sz w:val="24"/>
-          <w:szCs w:val="24"/>
-        </w:rPr>
-      </w:pPr>
-      <w:r>
-        <w:rPr>
-          <w:rFonts w:ascii="Arial" w:hAnsi="Arial" w:hint="default"/>
-          <w:sz w:val="29"/>
-          <w:szCs w:val="29"/>
-          <w:rtl w:val="0"/>
-        </w:rPr>
-        <w:t>    </w:t>
-      </w:r>
-      <w:r>
-        <w:rPr>
-          <w:rFonts w:ascii="Arial" w:hAnsi="Arial"/>
-          <w:sz w:val="29"/>
-          <w:szCs w:val="29"/>
-          <w:rtl w:val="0"/>
-        </w:rPr>
-        <w:t>{hlavni_prodejni_point_2}.&lt;br&gt;</w:t>
-      </w:r>
-    </w:p>
-    <w:p>
-      <w:pPr>
-        <w:pStyle w:val="Výchozí"/>
-        <w:suppressAutoHyphens w:val="1"/>
-        <w:spacing w:before="0" w:line="240" w:lineRule="auto"/>
-        <w:rPr>
-          <w:rFonts w:ascii="Times Roman" w:cs="Times Roman" w:hAnsi="Times Roman" w:eastAsia="Times Roman"/>
-          <w:sz w:val="24"/>
-          <w:szCs w:val="24"/>
-        </w:rPr>
-      </w:pPr>
-      <w:r>
-        <w:rPr>
-          <w:rFonts w:ascii="Arial" w:hAnsi="Arial" w:hint="default"/>
-          <w:sz w:val="29"/>
-          <w:szCs w:val="29"/>
-          <w:rtl w:val="0"/>
-        </w:rPr>
-        <w:t>    </w:t>
-      </w:r>
-      <w:r>
-        <w:rPr>
-          <w:rFonts w:ascii="Arial" w:hAnsi="Arial"/>
-          <w:sz w:val="29"/>
-          <w:szCs w:val="29"/>
-          <w:rtl w:val="0"/>
-        </w:rPr>
-        <w:t>{hlavni_prodejni_point_3}.</w:t>
-      </w:r>
-    </w:p>
-    <w:p>
-      <w:pPr>
-        <w:pStyle w:val="Výchozí"/>
-        <w:suppressAutoHyphens w:val="1"/>
-        <w:spacing w:before="0" w:line="240" w:lineRule="auto"/>
-        <w:rPr>
-          <w:rFonts w:ascii="Times Roman" w:cs="Times Roman" w:hAnsi="Times Roman" w:eastAsia="Times Roman"/>
-          <w:sz w:val="24"/>
-          <w:szCs w:val="24"/>
-        </w:rPr>
-      </w:pPr>
-      <w:r>
-        <w:rPr>
-          <w:rFonts w:ascii="Arial" w:hAnsi="Arial" w:hint="default"/>
-          <w:sz w:val="29"/>
-          <w:szCs w:val="29"/>
-          <w:rtl w:val="0"/>
-        </w:rPr>
-        <w:t>  </w:t>
-      </w:r>
-      <w:r>
-        <w:rPr>
-          <w:rFonts w:ascii="Arial" w:hAnsi="Arial"/>
-          <w:sz w:val="29"/>
-          <w:szCs w:val="29"/>
-          <w:rtl w:val="0"/>
-          <w:lang w:val="en-US"/>
-        </w:rPr>
-        <w:t>&lt;/p&gt;</w:t>
-      </w:r>
-    </w:p>
-    <w:p>
-      <w:pPr>
-        <w:pStyle w:val="Výchozí"/>
-        <w:suppressAutoHyphens w:val="1"/>
-        <w:spacing w:before="0" w:line="240" w:lineRule="auto"/>
-        <w:rPr>
-          <w:rFonts w:ascii="Times Roman" w:cs="Times Roman" w:hAnsi="Times Roman" w:eastAsia="Times Roman"/>
-        </w:rPr>
-      </w:pPr>
-    </w:p>
-    <w:p>
-      <w:pPr>
-        <w:pStyle w:val="Výchozí"/>
-        <w:suppressAutoHyphens w:val="1"/>
-        <w:spacing w:before="0" w:line="240" w:lineRule="auto"/>
-        <w:rPr>
-          <w:rFonts w:ascii="Times Roman" w:cs="Times Roman" w:hAnsi="Times Roman" w:eastAsia="Times Roman"/>
-          <w:sz w:val="24"/>
-          <w:szCs w:val="24"/>
-        </w:rPr>
-      </w:pPr>
-      <w:r>
-        <w:rPr>
-          <w:rFonts w:ascii="Arial" w:hAnsi="Arial" w:hint="default"/>
-          <w:sz w:val="29"/>
-          <w:szCs w:val="29"/>
-          <w:rtl w:val="0"/>
-        </w:rPr>
-        <w:t>  </w:t>
-      </w:r>
-      <w:r>
-        <w:rPr>
-          <w:rFonts w:ascii="Arial" w:hAnsi="Arial"/>
-          <w:sz w:val="29"/>
-          <w:szCs w:val="29"/>
-          <w:rtl w:val="0"/>
-        </w:rPr>
-        <w:t>&lt;p&gt;</w:t>
-      </w:r>
-    </w:p>
-    <w:p>
-      <w:pPr>
-        <w:pStyle w:val="Výchozí"/>
-        <w:suppressAutoHyphens w:val="1"/>
-        <w:spacing w:before="0" w:line="240" w:lineRule="auto"/>
-        <w:rPr>
-          <w:rFonts w:ascii="Times Roman" w:cs="Times Roman" w:hAnsi="Times Roman" w:eastAsia="Times Roman"/>
-          <w:sz w:val="24"/>
-          <w:szCs w:val="24"/>
-        </w:rPr>
-      </w:pPr>
-      <w:r>
-        <w:rPr>
-          <w:rFonts w:ascii="Arial" w:hAnsi="Arial" w:hint="default"/>
-          <w:sz w:val="29"/>
-          <w:szCs w:val="29"/>
-          <w:rtl w:val="0"/>
-        </w:rPr>
-        <w:t>    </w:t>
-      </w:r>
-      <w:r>
-        <w:rPr>
-          <w:rFonts w:ascii="Arial" w:hAnsi="Arial"/>
-          <w:sz w:val="29"/>
-          <w:szCs w:val="29"/>
-          <w:rtl w:val="0"/>
-        </w:rPr>
-        <w:t>&lt;em&gt;{doporu</w:t>
-      </w:r>
-      <w:r>
-        <w:rPr>
-          <w:rFonts w:ascii="Arial" w:hAnsi="Arial" w:hint="default"/>
-          <w:sz w:val="29"/>
-          <w:szCs w:val="29"/>
-          <w:rtl w:val="0"/>
+          <w:lang w:val="en-US"/>
+        </w:rPr>
+        <w:t>dy bez slo</w:t>
+      </w:r>
+      <w:r>
+        <w:rPr>
+          <w:rFonts w:ascii="Arial" w:hAnsi="Arial" w:hint="default"/>
+          <w:sz w:val="29"/>
+          <w:szCs w:val="29"/>
+          <w:rtl w:val="0"/>
+          <w:lang w:val="en-US"/>
+        </w:rPr>
+        <w:t>ž</w:t>
+      </w:r>
+      <w:r>
+        <w:rPr>
+          <w:rFonts w:ascii="Arial" w:hAnsi="Arial"/>
+          <w:sz w:val="29"/>
+          <w:szCs w:val="29"/>
+          <w:rtl w:val="0"/>
+          <w:lang w:val="en-US"/>
+        </w:rPr>
+        <w:t>it</w:t>
+      </w:r>
+      <w:r>
+        <w:rPr>
+          <w:rFonts w:ascii="Arial" w:hAnsi="Arial" w:hint="default"/>
+          <w:sz w:val="29"/>
+          <w:szCs w:val="29"/>
+          <w:rtl w:val="0"/>
+          <w:lang w:val="en-US"/>
+        </w:rPr>
+        <w:t>é</w:t>
+      </w:r>
+      <w:r>
+        <w:rPr>
+          <w:rFonts w:ascii="Arial" w:hAnsi="Arial"/>
+          <w:sz w:val="29"/>
+          <w:szCs w:val="29"/>
+          <w:rtl w:val="0"/>
+          <w:lang w:val="en-US"/>
+        </w:rPr>
+        <w:t>ho za</w:t>
+      </w:r>
+      <w:r>
+        <w:rPr>
+          <w:rFonts w:ascii="Arial" w:hAnsi="Arial" w:hint="default"/>
+          <w:sz w:val="29"/>
+          <w:szCs w:val="29"/>
+          <w:rtl w:val="0"/>
+          <w:lang w:val="en-US"/>
+        </w:rPr>
+        <w:t>čá</w:t>
+      </w:r>
+      <w:r>
+        <w:rPr>
+          <w:rFonts w:ascii="Arial" w:hAnsi="Arial"/>
+          <w:sz w:val="29"/>
+          <w:szCs w:val="29"/>
+          <w:rtl w:val="0"/>
+          <w:lang w:val="en-US"/>
+        </w:rPr>
+        <w:t>tku.</w:t>
+      </w:r>
+    </w:p>
+    <w:p>
+      <w:pPr>
+        <w:pStyle w:val="Výchozí"/>
+        <w:suppressAutoHyphens w:val="1"/>
+        <w:spacing w:before="0" w:line="240" w:lineRule="auto"/>
+        <w:rPr>
+          <w:rFonts w:ascii="Arial" w:cs="Arial" w:hAnsi="Arial" w:eastAsia="Arial"/>
+          <w:sz w:val="29"/>
+          <w:szCs w:val="29"/>
+        </w:rPr>
+      </w:pPr>
+      <w:r>
+        <w:rPr>
+          <w:rFonts w:ascii="Arial" w:hAnsi="Arial"/>
+          <w:sz w:val="29"/>
+          <w:szCs w:val="29"/>
+          <w:rtl w:val="0"/>
+          <w:lang w:val="en-US"/>
+        </w:rPr>
+        <w:t xml:space="preserve">  &lt;/p&gt;</w:t>
+      </w:r>
+    </w:p>
+    <w:p>
+      <w:pPr>
+        <w:pStyle w:val="Výchozí"/>
+        <w:suppressAutoHyphens w:val="1"/>
+        <w:spacing w:before="0" w:line="240" w:lineRule="auto"/>
+        <w:rPr>
+          <w:rFonts w:ascii="Arial" w:cs="Arial" w:hAnsi="Arial" w:eastAsia="Arial"/>
+          <w:sz w:val="29"/>
+          <w:szCs w:val="29"/>
+        </w:rPr>
+      </w:pPr>
+    </w:p>
+    <w:p>
+      <w:pPr>
+        <w:pStyle w:val="Výchozí"/>
+        <w:suppressAutoHyphens w:val="1"/>
+        <w:spacing w:before="0" w:line="240" w:lineRule="auto"/>
+        <w:rPr>
+          <w:rFonts w:ascii="Arial" w:cs="Arial" w:hAnsi="Arial" w:eastAsia="Arial"/>
+          <w:sz w:val="29"/>
+          <w:szCs w:val="29"/>
+        </w:rPr>
+      </w:pPr>
+      <w:r>
+        <w:rPr>
+          <w:rFonts w:ascii="Arial" w:hAnsi="Arial"/>
+          <w:sz w:val="29"/>
+          <w:szCs w:val="29"/>
+          <w:rtl w:val="0"/>
+          <w:lang w:val="en-US"/>
+        </w:rPr>
+        <w:t xml:space="preserve">  &lt;p&gt;</w:t>
+      </w:r>
+    </w:p>
+    <w:p>
+      <w:pPr>
+        <w:pStyle w:val="Výchozí"/>
+        <w:suppressAutoHyphens w:val="1"/>
+        <w:spacing w:before="0" w:line="240" w:lineRule="auto"/>
+        <w:rPr>
+          <w:rFonts w:ascii="Arial" w:cs="Arial" w:hAnsi="Arial" w:eastAsia="Arial"/>
+          <w:sz w:val="29"/>
+          <w:szCs w:val="29"/>
+        </w:rPr>
+      </w:pPr>
+      <w:r>
+        <w:rPr>
+          <w:rFonts w:ascii="Arial" w:hAnsi="Arial"/>
+          <w:sz w:val="29"/>
+          <w:szCs w:val="29"/>
+          <w:rtl w:val="0"/>
+          <w:lang w:val="en-US"/>
+        </w:rPr>
+        <w:t xml:space="preserve">    &lt;em&gt;{doporu</w:t>
+      </w:r>
+      <w:r>
+        <w:rPr>
+          <w:rFonts w:ascii="Arial" w:hAnsi="Arial" w:hint="default"/>
+          <w:sz w:val="29"/>
+          <w:szCs w:val="29"/>
+          <w:rtl w:val="0"/>
+          <w:lang w:val="en-US"/>
         </w:rPr>
         <w:t>č</w:t>
       </w:r>
@@ -1251,6 +1849,7 @@
           <w:sz w:val="29"/>
           <w:szCs w:val="29"/>
           <w:rtl w:val="0"/>
+          <w:lang w:val="en-US"/>
         </w:rPr>
         <w:t>en</w:t>
       </w:r>
@@ -1260,6 +1859,7 @@
           <w:sz w:val="29"/>
           <w:szCs w:val="29"/>
           <w:rtl w:val="0"/>
+          <w:lang w:val="en-US"/>
         </w:rPr>
         <w:t>í</w:t>
       </w:r>
@@ -1280,41 +1880,39 @@
         <w:suppressAutoHyphens w:val="1"/>
         <w:spacing w:before="0" w:line="240" w:lineRule="auto"/>
         <w:rPr>
-          <w:rFonts w:ascii="Times Roman" w:cs="Times Roman" w:hAnsi="Times Roman" w:eastAsia="Times Roman"/>
-          <w:sz w:val="24"/>
-          <w:szCs w:val="24"/>
-        </w:rPr>
-      </w:pPr>
-      <w:r>
-        <w:rPr>
-          <w:rFonts w:ascii="Arial" w:hAnsi="Arial" w:hint="default"/>
-          <w:sz w:val="29"/>
-          <w:szCs w:val="29"/>
-          <w:rtl w:val="0"/>
-        </w:rPr>
-        <w:t>  </w:t>
-      </w:r>
-      <w:r>
-        <w:rPr>
-          <w:rFonts w:ascii="Arial" w:hAnsi="Arial"/>
-          <w:sz w:val="29"/>
-          <w:szCs w:val="29"/>
-          <w:rtl w:val="0"/>
-          <w:lang w:val="en-US"/>
-        </w:rPr>
-        <w:t>&lt;/p&gt;</w:t>
-      </w:r>
-    </w:p>
-    <w:p>
-      <w:pPr>
-        <w:pStyle w:val="Výchozí"/>
-        <w:suppressAutoHyphens w:val="1"/>
-        <w:spacing w:before="0" w:line="240" w:lineRule="auto"/>
-        <w:rPr>
-          <w:rFonts w:ascii="Times Roman" w:cs="Times Roman" w:hAnsi="Times Roman" w:eastAsia="Times Roman"/>
-          <w:sz w:val="24"/>
-          <w:szCs w:val="24"/>
-        </w:rPr>
+          <w:rFonts w:ascii="Arial" w:cs="Arial" w:hAnsi="Arial" w:eastAsia="Arial"/>
+          <w:sz w:val="29"/>
+          <w:szCs w:val="29"/>
+        </w:rPr>
+      </w:pPr>
+      <w:r>
+        <w:rPr>
+          <w:rFonts w:ascii="Arial" w:hAnsi="Arial"/>
+          <w:sz w:val="29"/>
+          <w:szCs w:val="29"/>
+          <w:rtl w:val="0"/>
+          <w:lang w:val="en-US"/>
+        </w:rPr>
+        <w:t xml:space="preserve">  &lt;/p&gt;</w:t>
+      </w:r>
+    </w:p>
+    <w:p>
+      <w:pPr>
+        <w:pStyle w:val="Výchozí"/>
+        <w:suppressAutoHyphens w:val="1"/>
+        <w:spacing w:before="0" w:line="240" w:lineRule="auto"/>
+        <w:rPr>
+          <w:rFonts w:ascii="Arial" w:cs="Arial" w:hAnsi="Arial" w:eastAsia="Arial"/>
+          <w:sz w:val="29"/>
+          <w:szCs w:val="29"/>
+        </w:rPr>
+      </w:pPr>
+    </w:p>
+    <w:p>
+      <w:pPr>
+        <w:pStyle w:val="Výchozí"/>
+        <w:suppressAutoHyphens w:val="1"/>
+        <w:spacing w:before="0" w:line="240" w:lineRule="auto"/>
       </w:pPr>
       <w:r>
         <w:rPr>
@@ -1325,38 +1923,6 @@
           <w:lang w:val="en-US"/>
         </w:rPr>
         <w:t>&lt;/div&gt;</w:t>
-      </w:r>
-    </w:p>
-    <w:p>
-      <w:pPr>
-        <w:pStyle w:val="Výchozí"/>
-        <w:suppressAutoHyphens w:val="1"/>
-        <w:spacing w:before="0" w:line="240" w:lineRule="auto"/>
-        <w:rPr>
-          <w:rFonts w:ascii="Times Roman" w:cs="Times Roman" w:hAnsi="Times Roman" w:eastAsia="Times Roman"/>
-        </w:rPr>
-      </w:pPr>
-    </w:p>
-    <w:p>
-      <w:pPr>
-        <w:pStyle w:val="Výchozí"/>
-        <w:suppressAutoHyphens w:val="1"/>
-        <w:spacing w:before="0" w:line="240" w:lineRule="auto"/>
-        <w:rPr>
-          <w:rFonts w:ascii="Times Roman" w:cs="Times Roman" w:hAnsi="Times Roman" w:eastAsia="Times Roman"/>
-        </w:rPr>
-      </w:pPr>
-    </w:p>
-    <w:p>
-      <w:pPr>
-        <w:pStyle w:val="Výchozí"/>
-        <w:suppressAutoHyphens w:val="1"/>
-        <w:spacing w:before="0" w:line="240" w:lineRule="auto"/>
-      </w:pPr>
-      <w:r>
-        <w:rPr>
-          <w:rFonts w:ascii="Times Roman" w:cs="Times Roman" w:hAnsi="Times Roman" w:eastAsia="Times Roman"/>
-        </w:rPr>
       </w:r>
     </w:p>
     <w:sectPr>
@@ -1584,12 +2150,13 @@
       <w:position w:val="0"/>
       <w:sz w:val="24"/>
       <w:szCs w:val="24"/>
-      <w:u w:val="none"/>
+      <w:u w:val="none" w:color="000000"/>
       <w:shd w:val="nil" w:color="auto" w:fill="auto"/>
       <w:vertAlign w:val="baseline"/>
       <w:lang w:val="en-US"/>
-      <w14:textOutline>
+      <w14:textOutline w14:w="12700" w14:cap="flat">
         <w14:noFill/>
+        <w14:miter w14:lim="400000"/>
       </w14:textOutline>
       <w14:textFill>
         <w14:solidFill>

</xml_diff>